<commit_message>
docs: cap nhat duong dan repo Bai05 tren GitHub trong bao cao
</commit_message>
<xml_diff>
--- a/BaoCao_Lab_W05.docx
+++ b/BaoCao_Lab_W05.docx
@@ -5,7 +5,7 @@
     <w:p>
       <w:pPr>
         <w:pStyle w:val="Heading1"/>
-        <w:divId w:val="19162458"/>
+        <w:divId w:val="1249726624"/>
         <w:rPr>
           <w:rFonts w:eastAsia="Times New Roman"/>
         </w:rPr>
@@ -22,7 +22,7 @@
         <w:pStyle w:val="Heading3"/>
         <w:spacing w:before="0"/>
         <w:jc w:val="center"/>
-        <w:divId w:val="19162458"/>
+        <w:divId w:val="1249726624"/>
         <w:rPr>
           <w:rFonts w:eastAsia="Times New Roman"/>
           <w:color w:val="555555"/>
@@ -40,7 +40,7 @@
       <w:pPr>
         <w:shd w:val="clear" w:color="auto" w:fill="F4F6F7"/>
         <w:spacing w:before="60" w:after="60"/>
-        <w:divId w:val="1019039611"/>
+        <w:divId w:val="236212999"/>
         <w:rPr>
           <w:color w:val="111111"/>
         </w:rPr>
@@ -63,7 +63,7 @@
       <w:pPr>
         <w:shd w:val="clear" w:color="auto" w:fill="F4F6F7"/>
         <w:spacing w:before="60" w:after="60"/>
-        <w:divId w:val="1019039611"/>
+        <w:divId w:val="236212999"/>
         <w:rPr>
           <w:color w:val="111111"/>
         </w:rPr>
@@ -124,7 +124,7 @@
       <w:pPr>
         <w:shd w:val="clear" w:color="auto" w:fill="F4F6F7"/>
         <w:spacing w:before="60" w:after="60"/>
-        <w:divId w:val="1019039611"/>
+        <w:divId w:val="236212999"/>
         <w:rPr>
           <w:color w:val="111111"/>
         </w:rPr>
@@ -233,7 +233,7 @@
       <w:pPr>
         <w:shd w:val="clear" w:color="auto" w:fill="F4F6F7"/>
         <w:spacing w:before="60" w:after="60"/>
-        <w:divId w:val="1019039611"/>
+        <w:divId w:val="236212999"/>
         <w:rPr>
           <w:color w:val="111111"/>
         </w:rPr>
@@ -270,7 +270,7 @@
           <w:rPr>
             <w:rStyle w:val="Hyperlink"/>
           </w:rPr>
-          <w:t>https://github.com/ngminhduc129/OOP-Bai05-DeviceManagement</w:t>
+          <w:t>https://github.com/ngminhduc129/Bai05</w:t>
         </w:r>
       </w:hyperlink>
     </w:p>
@@ -278,7 +278,7 @@
       <w:pPr>
         <w:shd w:val="clear" w:color="auto" w:fill="F4F6F7"/>
         <w:spacing w:before="60" w:after="60"/>
-        <w:divId w:val="1019039611"/>
+        <w:divId w:val="236212999"/>
         <w:rPr>
           <w:color w:val="111111"/>
         </w:rPr>
@@ -352,7 +352,7 @@
     <w:p>
       <w:pPr>
         <w:pStyle w:val="Heading2"/>
-        <w:divId w:val="19162458"/>
+        <w:divId w:val="1249726624"/>
         <w:rPr>
           <w:rFonts w:eastAsia="Times New Roman"/>
         </w:rPr>
@@ -367,7 +367,7 @@
     <w:p>
       <w:pPr>
         <w:pStyle w:val="Heading3"/>
-        <w:divId w:val="19162458"/>
+        <w:divId w:val="1249726624"/>
         <w:rPr>
           <w:rFonts w:eastAsia="Times New Roman"/>
         </w:rPr>
@@ -382,7 +382,7 @@
     <w:p>
       <w:pPr>
         <w:pStyle w:val="NormalWeb"/>
-        <w:divId w:val="19162458"/>
+        <w:divId w:val="1249726624"/>
         <w:rPr>
           <w:color w:val="111111"/>
           <w:sz w:val="26"/>
@@ -741,7 +741,7 @@
           <w:numId w:val="1"/>
         </w:numPr>
         <w:spacing w:before="100" w:beforeAutospacing="1" w:after="75"/>
-        <w:divId w:val="19162458"/>
+        <w:divId w:val="1249726624"/>
         <w:rPr>
           <w:rFonts w:eastAsia="Times New Roman"/>
           <w:color w:val="111111"/>
@@ -776,7 +776,7 @@
           <w:numId w:val="1"/>
         </w:numPr>
         <w:spacing w:before="100" w:beforeAutospacing="1" w:after="75"/>
-        <w:divId w:val="19162458"/>
+        <w:divId w:val="1249726624"/>
         <w:rPr>
           <w:rFonts w:eastAsia="Times New Roman"/>
           <w:color w:val="111111"/>
@@ -820,7 +820,7 @@
           <w:numId w:val="1"/>
         </w:numPr>
         <w:spacing w:before="100" w:beforeAutospacing="1" w:after="75"/>
-        <w:divId w:val="19162458"/>
+        <w:divId w:val="1249726624"/>
         <w:rPr>
           <w:rFonts w:eastAsia="Times New Roman"/>
           <w:color w:val="111111"/>
@@ -855,7 +855,7 @@
           <w:numId w:val="1"/>
         </w:numPr>
         <w:spacing w:before="100" w:beforeAutospacing="1" w:after="75"/>
-        <w:divId w:val="19162458"/>
+        <w:divId w:val="1249726624"/>
         <w:rPr>
           <w:rFonts w:eastAsia="Times New Roman"/>
           <w:color w:val="111111"/>
@@ -886,7 +886,7 @@
     <w:p>
       <w:pPr>
         <w:pStyle w:val="Heading3"/>
-        <w:divId w:val="19162458"/>
+        <w:divId w:val="1249726624"/>
         <w:rPr>
           <w:rFonts w:eastAsia="Times New Roman"/>
         </w:rPr>
@@ -905,7 +905,7 @@
           <w:numId w:val="2"/>
         </w:numPr>
         <w:spacing w:before="100" w:beforeAutospacing="1" w:after="75"/>
-        <w:divId w:val="19162458"/>
+        <w:divId w:val="1249726624"/>
         <w:rPr>
           <w:rFonts w:eastAsia="Times New Roman"/>
           <w:color w:val="111111"/>
@@ -940,7 +940,7 @@
           <w:numId w:val="2"/>
         </w:numPr>
         <w:spacing w:before="100" w:beforeAutospacing="1" w:after="75"/>
-        <w:divId w:val="19162458"/>
+        <w:divId w:val="1249726624"/>
         <w:rPr>
           <w:rFonts w:eastAsia="Times New Roman"/>
           <w:color w:val="111111"/>
@@ -965,7 +965,7 @@
           <w:numId w:val="2"/>
         </w:numPr>
         <w:spacing w:before="100" w:beforeAutospacing="1" w:after="75"/>
-        <w:divId w:val="19162458"/>
+        <w:divId w:val="1249726624"/>
         <w:rPr>
           <w:rFonts w:eastAsia="Times New Roman"/>
           <w:color w:val="111111"/>
@@ -990,7 +990,7 @@
           <w:numId w:val="2"/>
         </w:numPr>
         <w:spacing w:before="100" w:beforeAutospacing="1" w:after="75"/>
-        <w:divId w:val="19162458"/>
+        <w:divId w:val="1249726624"/>
         <w:rPr>
           <w:rFonts w:eastAsia="Times New Roman"/>
           <w:color w:val="111111"/>
@@ -1015,7 +1015,7 @@
           <w:numId w:val="2"/>
         </w:numPr>
         <w:spacing w:before="100" w:beforeAutospacing="1" w:after="75"/>
-        <w:divId w:val="19162458"/>
+        <w:divId w:val="1249726624"/>
         <w:rPr>
           <w:rFonts w:eastAsia="Times New Roman"/>
           <w:color w:val="111111"/>
@@ -1041,7 +1041,7 @@
           <w:numId w:val="2"/>
         </w:numPr>
         <w:spacing w:before="100" w:beforeAutospacing="1" w:after="75"/>
-        <w:divId w:val="19162458"/>
+        <w:divId w:val="1249726624"/>
         <w:rPr>
           <w:rFonts w:eastAsia="Times New Roman"/>
           <w:color w:val="111111"/>
@@ -1066,7 +1066,7 @@
           <w:numId w:val="2"/>
         </w:numPr>
         <w:spacing w:before="100" w:beforeAutospacing="1" w:after="75"/>
-        <w:divId w:val="19162458"/>
+        <w:divId w:val="1249726624"/>
         <w:rPr>
           <w:rFonts w:eastAsia="Times New Roman"/>
           <w:color w:val="111111"/>
@@ -1101,7 +1101,7 @@
           <w:numId w:val="2"/>
         </w:numPr>
         <w:spacing w:before="100" w:beforeAutospacing="1" w:after="75"/>
-        <w:divId w:val="19162458"/>
+        <w:divId w:val="1249726624"/>
         <w:rPr>
           <w:rFonts w:eastAsia="Times New Roman"/>
           <w:color w:val="111111"/>
@@ -1152,7 +1152,7 @@
           <w:numId w:val="2"/>
         </w:numPr>
         <w:spacing w:before="100" w:beforeAutospacing="1" w:after="75"/>
-        <w:divId w:val="19162458"/>
+        <w:divId w:val="1249726624"/>
         <w:rPr>
           <w:rFonts w:eastAsia="Times New Roman"/>
           <w:color w:val="111111"/>
@@ -1212,7 +1212,7 @@
           <w:numId w:val="2"/>
         </w:numPr>
         <w:spacing w:before="100" w:beforeAutospacing="1" w:after="75"/>
-        <w:divId w:val="19162458"/>
+        <w:divId w:val="1249726624"/>
         <w:rPr>
           <w:rFonts w:eastAsia="Times New Roman"/>
           <w:color w:val="111111"/>
@@ -1247,7 +1247,7 @@
           <w:numId w:val="2"/>
         </w:numPr>
         <w:spacing w:before="100" w:beforeAutospacing="1" w:after="75"/>
-        <w:divId w:val="19162458"/>
+        <w:divId w:val="1249726624"/>
         <w:rPr>
           <w:rFonts w:eastAsia="Times New Roman"/>
           <w:color w:val="111111"/>
@@ -1282,7 +1282,7 @@
           <w:numId w:val="2"/>
         </w:numPr>
         <w:spacing w:before="100" w:beforeAutospacing="1" w:after="75"/>
-        <w:divId w:val="19162458"/>
+        <w:divId w:val="1249726624"/>
         <w:rPr>
           <w:rFonts w:eastAsia="Times New Roman"/>
           <w:color w:val="111111"/>
@@ -1307,7 +1307,7 @@
           <w:numId w:val="2"/>
         </w:numPr>
         <w:spacing w:before="100" w:beforeAutospacing="1" w:after="75"/>
-        <w:divId w:val="19162458"/>
+        <w:divId w:val="1249726624"/>
         <w:rPr>
           <w:rFonts w:eastAsia="Times New Roman"/>
           <w:color w:val="111111"/>
@@ -1332,7 +1332,7 @@
           <w:numId w:val="2"/>
         </w:numPr>
         <w:spacing w:before="100" w:beforeAutospacing="1" w:after="75"/>
-        <w:divId w:val="19162458"/>
+        <w:divId w:val="1249726624"/>
         <w:rPr>
           <w:rFonts w:eastAsia="Times New Roman"/>
           <w:color w:val="111111"/>
@@ -1389,7 +1389,7 @@
           <w:numId w:val="2"/>
         </w:numPr>
         <w:spacing w:before="100" w:beforeAutospacing="1" w:after="75"/>
-        <w:divId w:val="19162458"/>
+        <w:divId w:val="1249726624"/>
         <w:rPr>
           <w:rFonts w:eastAsia="Times New Roman"/>
           <w:color w:val="111111"/>
@@ -1424,7 +1424,7 @@
           <w:numId w:val="2"/>
         </w:numPr>
         <w:spacing w:before="100" w:beforeAutospacing="1" w:after="75"/>
-        <w:divId w:val="19162458"/>
+        <w:divId w:val="1249726624"/>
         <w:rPr>
           <w:rFonts w:eastAsia="Times New Roman"/>
           <w:color w:val="111111"/>
@@ -1465,7 +1465,7 @@
           <w:numId w:val="2"/>
         </w:numPr>
         <w:spacing w:before="100" w:beforeAutospacing="1" w:after="75"/>
-        <w:divId w:val="19162458"/>
+        <w:divId w:val="1249726624"/>
         <w:rPr>
           <w:rFonts w:eastAsia="Times New Roman"/>
           <w:color w:val="111111"/>
@@ -1490,7 +1490,7 @@
           <w:numId w:val="2"/>
         </w:numPr>
         <w:spacing w:before="100" w:beforeAutospacing="1" w:after="75"/>
-        <w:divId w:val="19162458"/>
+        <w:divId w:val="1249726624"/>
         <w:rPr>
           <w:rFonts w:eastAsia="Times New Roman"/>
           <w:color w:val="111111"/>
@@ -1531,7 +1531,7 @@
           <w:numId w:val="2"/>
         </w:numPr>
         <w:spacing w:before="100" w:beforeAutospacing="1" w:after="75"/>
-        <w:divId w:val="19162458"/>
+        <w:divId w:val="1249726624"/>
         <w:rPr>
           <w:rFonts w:eastAsia="Times New Roman"/>
           <w:color w:val="111111"/>
@@ -1591,7 +1591,7 @@
           <w:numId w:val="2"/>
         </w:numPr>
         <w:spacing w:before="100" w:beforeAutospacing="1" w:after="75"/>
-        <w:divId w:val="19162458"/>
+        <w:divId w:val="1249726624"/>
         <w:rPr>
           <w:rFonts w:eastAsia="Times New Roman"/>
           <w:color w:val="111111"/>
@@ -1628,7 +1628,7 @@
     <w:p>
       <w:pPr>
         <w:pStyle w:val="Heading2"/>
-        <w:divId w:val="19162458"/>
+        <w:divId w:val="1249726624"/>
         <w:rPr>
           <w:rFonts w:eastAsia="Times New Roman"/>
         </w:rPr>
@@ -1643,7 +1643,7 @@
     <w:p>
       <w:pPr>
         <w:pStyle w:val="Heading3"/>
-        <w:divId w:val="19162458"/>
+        <w:divId w:val="1249726624"/>
         <w:rPr>
           <w:rFonts w:eastAsia="Times New Roman"/>
         </w:rPr>
@@ -1673,7 +1673,7 @@
       </w:tblGrid>
       <w:tr>
         <w:trPr>
-          <w:divId w:val="19162458"/>
+          <w:divId w:val="1249726624"/>
           <w:tblHeader/>
         </w:trPr>
         <w:tc>
@@ -1812,7 +1812,7 @@
       </w:tr>
       <w:tr>
         <w:trPr>
-          <w:divId w:val="19162458"/>
+          <w:divId w:val="1249726624"/>
         </w:trPr>
         <w:tc>
           <w:tcPr>
@@ -1980,7 +1980,7 @@
       </w:tr>
       <w:tr>
         <w:trPr>
-          <w:divId w:val="19162458"/>
+          <w:divId w:val="1249726624"/>
         </w:trPr>
         <w:tc>
           <w:tcPr>
@@ -2116,7 +2116,7 @@
       </w:tr>
       <w:tr>
         <w:trPr>
-          <w:divId w:val="19162458"/>
+          <w:divId w:val="1249726624"/>
         </w:trPr>
         <w:tc>
           <w:tcPr>
@@ -2300,7 +2300,7 @@
       </w:tr>
       <w:tr>
         <w:trPr>
-          <w:divId w:val="19162458"/>
+          <w:divId w:val="1249726624"/>
         </w:trPr>
         <w:tc>
           <w:tcPr>
@@ -2452,7 +2452,7 @@
       </w:tr>
       <w:tr>
         <w:trPr>
-          <w:divId w:val="19162458"/>
+          <w:divId w:val="1249726624"/>
         </w:trPr>
         <w:tc>
           <w:tcPr>
@@ -2588,7 +2588,7 @@
       </w:tr>
       <w:tr>
         <w:trPr>
-          <w:divId w:val="19162458"/>
+          <w:divId w:val="1249726624"/>
         </w:trPr>
         <w:tc>
           <w:tcPr>
@@ -2740,7 +2740,7 @@
       </w:tr>
       <w:tr>
         <w:trPr>
-          <w:divId w:val="19162458"/>
+          <w:divId w:val="1249726624"/>
         </w:trPr>
         <w:tc>
           <w:tcPr>
@@ -2876,7 +2876,7 @@
       </w:tr>
       <w:tr>
         <w:trPr>
-          <w:divId w:val="19162458"/>
+          <w:divId w:val="1249726624"/>
         </w:trPr>
         <w:tc>
           <w:tcPr>
@@ -2998,7 +2998,7 @@
     <w:p>
       <w:pPr>
         <w:pStyle w:val="Heading3"/>
-        <w:divId w:val="19162458"/>
+        <w:divId w:val="1249726624"/>
         <w:rPr>
           <w:rFonts w:eastAsia="Times New Roman"/>
         </w:rPr>
@@ -3013,7 +3013,7 @@
     <w:p>
       <w:pPr>
         <w:pStyle w:val="HTMLPreformatted"/>
-        <w:divId w:val="19162458"/>
+        <w:divId w:val="1249726624"/>
         <w:rPr>
           <w:color w:val="111111"/>
         </w:rPr>
@@ -3022,7 +3022,7 @@
     <w:p>
       <w:pPr>
         <w:pStyle w:val="HTMLPreformatted"/>
-        <w:divId w:val="19162458"/>
+        <w:divId w:val="1249726624"/>
         <w:rPr>
           <w:color w:val="111111"/>
         </w:rPr>
@@ -3037,7 +3037,7 @@
     <w:p>
       <w:pPr>
         <w:pStyle w:val="HTMLPreformatted"/>
-        <w:divId w:val="19162458"/>
+        <w:divId w:val="1249726624"/>
         <w:rPr>
           <w:color w:val="111111"/>
         </w:rPr>
@@ -3052,7 +3052,7 @@
     <w:p>
       <w:pPr>
         <w:pStyle w:val="HTMLPreformatted"/>
-        <w:divId w:val="19162458"/>
+        <w:divId w:val="1249726624"/>
         <w:rPr>
           <w:color w:val="111111"/>
         </w:rPr>
@@ -3067,7 +3067,7 @@
     <w:p>
       <w:pPr>
         <w:pStyle w:val="HTMLPreformatted"/>
-        <w:divId w:val="19162458"/>
+        <w:divId w:val="1249726624"/>
         <w:rPr>
           <w:color w:val="111111"/>
         </w:rPr>
@@ -3083,7 +3083,7 @@
     <w:p>
       <w:pPr>
         <w:pStyle w:val="HTMLPreformatted"/>
-        <w:divId w:val="19162458"/>
+        <w:divId w:val="1249726624"/>
         <w:rPr>
           <w:color w:val="111111"/>
         </w:rPr>
@@ -3098,7 +3098,7 @@
     <w:p>
       <w:pPr>
         <w:pStyle w:val="HTMLPreformatted"/>
-        <w:divId w:val="19162458"/>
+        <w:divId w:val="1249726624"/>
         <w:rPr>
           <w:color w:val="111111"/>
         </w:rPr>
@@ -3113,7 +3113,7 @@
     <w:p>
       <w:pPr>
         <w:pStyle w:val="HTMLPreformatted"/>
-        <w:divId w:val="19162458"/>
+        <w:divId w:val="1249726624"/>
         <w:rPr>
           <w:color w:val="111111"/>
         </w:rPr>
@@ -3128,7 +3128,7 @@
     <w:p>
       <w:pPr>
         <w:pStyle w:val="HTMLPreformatted"/>
-        <w:divId w:val="19162458"/>
+        <w:divId w:val="1249726624"/>
         <w:rPr>
           <w:color w:val="111111"/>
         </w:rPr>
@@ -3143,7 +3143,7 @@
     <w:p>
       <w:pPr>
         <w:pStyle w:val="HTMLPreformatted"/>
-        <w:divId w:val="19162458"/>
+        <w:divId w:val="1249726624"/>
         <w:rPr>
           <w:color w:val="111111"/>
         </w:rPr>
@@ -3158,7 +3158,7 @@
     <w:p>
       <w:pPr>
         <w:pStyle w:val="HTMLPreformatted"/>
-        <w:divId w:val="19162458"/>
+        <w:divId w:val="1249726624"/>
         <w:rPr>
           <w:color w:val="111111"/>
         </w:rPr>
@@ -3173,7 +3173,7 @@
     <w:p>
       <w:pPr>
         <w:pStyle w:val="HTMLPreformatted"/>
-        <w:divId w:val="19162458"/>
+        <w:divId w:val="1249726624"/>
         <w:rPr>
           <w:color w:val="111111"/>
         </w:rPr>
@@ -3188,7 +3188,7 @@
     <w:p>
       <w:pPr>
         <w:pStyle w:val="HTMLPreformatted"/>
-        <w:divId w:val="19162458"/>
+        <w:divId w:val="1249726624"/>
         <w:rPr>
           <w:color w:val="111111"/>
         </w:rPr>
@@ -3227,7 +3227,7 @@
     <w:p>
       <w:pPr>
         <w:pStyle w:val="HTMLPreformatted"/>
-        <w:divId w:val="19162458"/>
+        <w:divId w:val="1249726624"/>
         <w:rPr>
           <w:color w:val="111111"/>
         </w:rPr>
@@ -3242,7 +3242,7 @@
     <w:p>
       <w:pPr>
         <w:pStyle w:val="HTMLPreformatted"/>
-        <w:divId w:val="19162458"/>
+        <w:divId w:val="1249726624"/>
         <w:rPr>
           <w:color w:val="111111"/>
         </w:rPr>
@@ -3257,7 +3257,7 @@
     <w:p>
       <w:pPr>
         <w:pStyle w:val="HTMLPreformatted"/>
-        <w:divId w:val="19162458"/>
+        <w:divId w:val="1249726624"/>
         <w:rPr>
           <w:color w:val="111111"/>
         </w:rPr>
@@ -3272,7 +3272,7 @@
     <w:p>
       <w:pPr>
         <w:pStyle w:val="HTMLPreformatted"/>
-        <w:divId w:val="19162458"/>
+        <w:divId w:val="1249726624"/>
         <w:rPr>
           <w:color w:val="111111"/>
         </w:rPr>
@@ -3293,7 +3293,7 @@
     <w:p>
       <w:pPr>
         <w:pStyle w:val="HTMLPreformatted"/>
-        <w:divId w:val="19162458"/>
+        <w:divId w:val="1249726624"/>
         <w:rPr>
           <w:color w:val="111111"/>
         </w:rPr>
@@ -3308,7 +3308,7 @@
     <w:p>
       <w:pPr>
         <w:pStyle w:val="HTMLPreformatted"/>
-        <w:divId w:val="19162458"/>
+        <w:divId w:val="1249726624"/>
         <w:rPr>
           <w:color w:val="111111"/>
         </w:rPr>
@@ -3347,7 +3347,7 @@
     <w:p>
       <w:pPr>
         <w:pStyle w:val="HTMLPreformatted"/>
-        <w:divId w:val="19162458"/>
+        <w:divId w:val="1249726624"/>
         <w:rPr>
           <w:color w:val="111111"/>
         </w:rPr>
@@ -3362,7 +3362,7 @@
     <w:p>
       <w:pPr>
         <w:pStyle w:val="HTMLPreformatted"/>
-        <w:divId w:val="19162458"/>
+        <w:divId w:val="1249726624"/>
         <w:rPr>
           <w:color w:val="111111"/>
         </w:rPr>
@@ -3377,7 +3377,7 @@
     <w:p>
       <w:pPr>
         <w:pStyle w:val="HTMLPreformatted"/>
-        <w:divId w:val="19162458"/>
+        <w:divId w:val="1249726624"/>
         <w:rPr>
           <w:color w:val="111111"/>
         </w:rPr>
@@ -3392,7 +3392,7 @@
     <w:p>
       <w:pPr>
         <w:pStyle w:val="HTMLPreformatted"/>
-        <w:divId w:val="19162458"/>
+        <w:divId w:val="1249726624"/>
         <w:rPr>
           <w:color w:val="111111"/>
         </w:rPr>
@@ -3407,7 +3407,7 @@
     <w:p>
       <w:pPr>
         <w:pStyle w:val="HTMLPreformatted"/>
-        <w:divId w:val="19162458"/>
+        <w:divId w:val="1249726624"/>
         <w:rPr>
           <w:color w:val="111111"/>
         </w:rPr>
@@ -3422,7 +3422,7 @@
     <w:p>
       <w:pPr>
         <w:pStyle w:val="HTMLPreformatted"/>
-        <w:divId w:val="19162458"/>
+        <w:divId w:val="1249726624"/>
         <w:rPr>
           <w:color w:val="111111"/>
         </w:rPr>
@@ -3437,7 +3437,7 @@
     <w:p>
       <w:pPr>
         <w:pStyle w:val="HTMLPreformatted"/>
-        <w:divId w:val="19162458"/>
+        <w:divId w:val="1249726624"/>
         <w:rPr>
           <w:color w:val="111111"/>
         </w:rPr>
@@ -3458,7 +3458,7 @@
     <w:p>
       <w:pPr>
         <w:pStyle w:val="HTMLPreformatted"/>
-        <w:divId w:val="19162458"/>
+        <w:divId w:val="1249726624"/>
         <w:rPr>
           <w:color w:val="111111"/>
         </w:rPr>
@@ -3473,7 +3473,7 @@
     <w:p>
       <w:pPr>
         <w:pStyle w:val="HTMLPreformatted"/>
-        <w:divId w:val="19162458"/>
+        <w:divId w:val="1249726624"/>
         <w:rPr>
           <w:color w:val="111111"/>
         </w:rPr>
@@ -3488,7 +3488,7 @@
     <w:p>
       <w:pPr>
         <w:pStyle w:val="HTMLPreformatted"/>
-        <w:divId w:val="19162458"/>
+        <w:divId w:val="1249726624"/>
         <w:rPr>
           <w:color w:val="111111"/>
         </w:rPr>
@@ -3551,7 +3551,7 @@
     <w:p>
       <w:pPr>
         <w:pStyle w:val="HTMLPreformatted"/>
-        <w:divId w:val="19162458"/>
+        <w:divId w:val="1249726624"/>
         <w:rPr>
           <w:color w:val="111111"/>
         </w:rPr>
@@ -3566,7 +3566,7 @@
     <w:p>
       <w:pPr>
         <w:pStyle w:val="HTMLPreformatted"/>
-        <w:divId w:val="19162458"/>
+        <w:divId w:val="1249726624"/>
         <w:rPr>
           <w:color w:val="111111"/>
         </w:rPr>
@@ -3581,7 +3581,7 @@
     <w:p>
       <w:pPr>
         <w:pStyle w:val="HTMLPreformatted"/>
-        <w:divId w:val="19162458"/>
+        <w:divId w:val="1249726624"/>
         <w:rPr>
           <w:color w:val="111111"/>
         </w:rPr>
@@ -3596,7 +3596,7 @@
     <w:p>
       <w:pPr>
         <w:pStyle w:val="HTMLPreformatted"/>
-        <w:divId w:val="19162458"/>
+        <w:divId w:val="1249726624"/>
         <w:rPr>
           <w:color w:val="111111"/>
         </w:rPr>
@@ -3611,7 +3611,7 @@
     <w:p>
       <w:pPr>
         <w:pStyle w:val="HTMLPreformatted"/>
-        <w:divId w:val="19162458"/>
+        <w:divId w:val="1249726624"/>
         <w:rPr>
           <w:color w:val="111111"/>
         </w:rPr>
@@ -3626,7 +3626,7 @@
     <w:p>
       <w:pPr>
         <w:pStyle w:val="HTMLPreformatted"/>
-        <w:divId w:val="19162458"/>
+        <w:divId w:val="1249726624"/>
         <w:rPr>
           <w:color w:val="111111"/>
         </w:rPr>
@@ -3647,7 +3647,7 @@
     <w:p>
       <w:pPr>
         <w:pStyle w:val="HTMLPreformatted"/>
-        <w:divId w:val="19162458"/>
+        <w:divId w:val="1249726624"/>
         <w:rPr>
           <w:color w:val="111111"/>
         </w:rPr>
@@ -3662,7 +3662,7 @@
     <w:p>
       <w:pPr>
         <w:pStyle w:val="HTMLPreformatted"/>
-        <w:divId w:val="19162458"/>
+        <w:divId w:val="1249726624"/>
         <w:rPr>
           <w:color w:val="111111"/>
         </w:rPr>
@@ -3677,7 +3677,7 @@
     <w:p>
       <w:pPr>
         <w:pStyle w:val="HTMLPreformatted"/>
-        <w:divId w:val="19162458"/>
+        <w:divId w:val="1249726624"/>
         <w:rPr>
           <w:color w:val="111111"/>
         </w:rPr>
@@ -3692,7 +3692,7 @@
     <w:p>
       <w:pPr>
         <w:pStyle w:val="HTMLPreformatted"/>
-        <w:divId w:val="19162458"/>
+        <w:divId w:val="1249726624"/>
         <w:rPr>
           <w:color w:val="111111"/>
         </w:rPr>
@@ -3707,7 +3707,7 @@
     <w:p>
       <w:pPr>
         <w:pStyle w:val="HTMLPreformatted"/>
-        <w:divId w:val="19162458"/>
+        <w:divId w:val="1249726624"/>
         <w:rPr>
           <w:color w:val="111111"/>
         </w:rPr>
@@ -3722,7 +3722,7 @@
     <w:p>
       <w:pPr>
         <w:pStyle w:val="HTMLPreformatted"/>
-        <w:divId w:val="19162458"/>
+        <w:divId w:val="1249726624"/>
         <w:rPr>
           <w:color w:val="111111"/>
         </w:rPr>
@@ -3737,7 +3737,7 @@
     <w:p>
       <w:pPr>
         <w:pStyle w:val="HTMLPreformatted"/>
-        <w:divId w:val="19162458"/>
+        <w:divId w:val="1249726624"/>
         <w:rPr>
           <w:color w:val="111111"/>
         </w:rPr>
@@ -3759,7 +3759,7 @@
     <w:p>
       <w:pPr>
         <w:pStyle w:val="HTMLPreformatted"/>
-        <w:divId w:val="19162458"/>
+        <w:divId w:val="1249726624"/>
         <w:rPr>
           <w:color w:val="111111"/>
         </w:rPr>
@@ -3774,7 +3774,7 @@
     <w:p>
       <w:pPr>
         <w:pStyle w:val="HTMLPreformatted"/>
-        <w:divId w:val="19162458"/>
+        <w:divId w:val="1249726624"/>
         <w:rPr>
           <w:color w:val="111111"/>
         </w:rPr>
@@ -3789,7 +3789,7 @@
     <w:p>
       <w:pPr>
         <w:pStyle w:val="HTMLPreformatted"/>
-        <w:divId w:val="19162458"/>
+        <w:divId w:val="1249726624"/>
         <w:rPr>
           <w:color w:val="111111"/>
         </w:rPr>
@@ -3804,7 +3804,7 @@
     <w:p>
       <w:pPr>
         <w:pStyle w:val="HTMLPreformatted"/>
-        <w:divId w:val="19162458"/>
+        <w:divId w:val="1249726624"/>
         <w:rPr>
           <w:color w:val="111111"/>
         </w:rPr>
@@ -3819,7 +3819,7 @@
     <w:p>
       <w:pPr>
         <w:pStyle w:val="HTMLPreformatted"/>
-        <w:divId w:val="19162458"/>
+        <w:divId w:val="1249726624"/>
         <w:rPr>
           <w:color w:val="111111"/>
         </w:rPr>
@@ -3882,7 +3882,7 @@
     <w:p>
       <w:pPr>
         <w:pStyle w:val="HTMLPreformatted"/>
-        <w:divId w:val="19162458"/>
+        <w:divId w:val="1249726624"/>
         <w:rPr>
           <w:color w:val="111111"/>
         </w:rPr>
@@ -3897,7 +3897,7 @@
     <w:p>
       <w:pPr>
         <w:pStyle w:val="HTMLPreformatted"/>
-        <w:divId w:val="19162458"/>
+        <w:divId w:val="1249726624"/>
         <w:rPr>
           <w:color w:val="111111"/>
         </w:rPr>
@@ -3912,7 +3912,7 @@
     <w:p>
       <w:pPr>
         <w:pStyle w:val="HTMLPreformatted"/>
-        <w:divId w:val="19162458"/>
+        <w:divId w:val="1249726624"/>
         <w:rPr>
           <w:color w:val="111111"/>
         </w:rPr>
@@ -3933,7 +3933,7 @@
     <w:p>
       <w:pPr>
         <w:pStyle w:val="HTMLPreformatted"/>
-        <w:divId w:val="19162458"/>
+        <w:divId w:val="1249726624"/>
         <w:rPr>
           <w:color w:val="111111"/>
         </w:rPr>
@@ -3948,7 +3948,7 @@
     <w:p>
       <w:pPr>
         <w:pStyle w:val="Heading2"/>
-        <w:divId w:val="19162458"/>
+        <w:divId w:val="1249726624"/>
         <w:rPr>
           <w:rFonts w:eastAsia="Times New Roman"/>
         </w:rPr>
@@ -3963,7 +3963,7 @@
     <w:p>
       <w:pPr>
         <w:pStyle w:val="Heading3"/>
-        <w:divId w:val="19162458"/>
+        <w:divId w:val="1249726624"/>
         <w:rPr>
           <w:rFonts w:eastAsia="Times New Roman"/>
         </w:rPr>
@@ -3990,7 +3990,7 @@
     <w:p>
       <w:pPr>
         <w:pStyle w:val="NormalWeb"/>
-        <w:divId w:val="19162458"/>
+        <w:divId w:val="1249726624"/>
         <w:rPr>
           <w:color w:val="111111"/>
           <w:sz w:val="26"/>
@@ -4826,7 +4826,7 @@
     <w:p>
       <w:pPr>
         <w:pStyle w:val="NormalWeb"/>
-        <w:divId w:val="19162458"/>
+        <w:divId w:val="1249726624"/>
         <w:rPr>
           <w:color w:val="111111"/>
           <w:sz w:val="26"/>
@@ -5762,7 +5762,7 @@
     <w:p>
       <w:pPr>
         <w:pStyle w:val="Heading3"/>
-        <w:divId w:val="19162458"/>
+        <w:divId w:val="1249726624"/>
         <w:rPr>
           <w:rFonts w:eastAsia="Times New Roman"/>
         </w:rPr>
@@ -5789,7 +5789,7 @@
     <w:p>
       <w:pPr>
         <w:pStyle w:val="NormalWeb"/>
-        <w:divId w:val="19162458"/>
+        <w:divId w:val="1249726624"/>
         <w:rPr>
           <w:color w:val="111111"/>
           <w:sz w:val="26"/>
@@ -6427,7 +6427,7 @@
     <w:p>
       <w:pPr>
         <w:pStyle w:val="NormalWeb"/>
-        <w:divId w:val="19162458"/>
+        <w:divId w:val="1249726624"/>
         <w:rPr>
           <w:color w:val="111111"/>
           <w:sz w:val="26"/>
@@ -7174,7 +7174,7 @@
     <w:p>
       <w:pPr>
         <w:pStyle w:val="NormalWeb"/>
-        <w:divId w:val="19162458"/>
+        <w:divId w:val="1249726624"/>
         <w:rPr>
           <w:color w:val="111111"/>
           <w:sz w:val="26"/>
@@ -7638,7 +7638,7 @@
     <w:p>
       <w:pPr>
         <w:pStyle w:val="Heading3"/>
-        <w:divId w:val="19162458"/>
+        <w:divId w:val="1249726624"/>
         <w:rPr>
           <w:rFonts w:eastAsia="Times New Roman"/>
         </w:rPr>
@@ -7653,7 +7653,7 @@
     <w:p>
       <w:pPr>
         <w:pStyle w:val="NormalWeb"/>
-        <w:divId w:val="19162458"/>
+        <w:divId w:val="1249726624"/>
         <w:rPr>
           <w:color w:val="111111"/>
           <w:sz w:val="26"/>
@@ -7788,7 +7788,7 @@
           <w:numId w:val="3"/>
         </w:numPr>
         <w:spacing w:before="100" w:beforeAutospacing="1" w:after="75"/>
-        <w:divId w:val="19162458"/>
+        <w:divId w:val="1249726624"/>
         <w:rPr>
           <w:rFonts w:eastAsia="Times New Roman"/>
           <w:color w:val="111111"/>
@@ -7862,7 +7862,7 @@
       <w:pPr>
         <w:pStyle w:val="HTMLPreformatted"/>
         <w:ind w:left="720"/>
-        <w:divId w:val="19162458"/>
+        <w:divId w:val="1249726624"/>
         <w:rPr>
           <w:color w:val="111111"/>
         </w:rPr>
@@ -7878,7 +7878,7 @@
       <w:pPr>
         <w:spacing w:beforeAutospacing="1"/>
         <w:ind w:left="720"/>
-        <w:divId w:val="19162458"/>
+        <w:divId w:val="1249726624"/>
         <w:rPr>
           <w:rFonts w:eastAsia="Times New Roman"/>
           <w:color w:val="111111"/>
@@ -8015,7 +8015,7 @@
           <w:numId w:val="3"/>
         </w:numPr>
         <w:spacing w:before="100" w:beforeAutospacing="1" w:after="75"/>
-        <w:divId w:val="19162458"/>
+        <w:divId w:val="1249726624"/>
         <w:rPr>
           <w:rFonts w:eastAsia="Times New Roman"/>
           <w:color w:val="111111"/>
@@ -8078,7 +8078,7 @@
         <w:tabs>
           <w:tab w:val="clear" w:pos="720"/>
         </w:tabs>
-        <w:divId w:val="19162458"/>
+        <w:divId w:val="1249726624"/>
         <w:rPr>
           <w:color w:val="111111"/>
         </w:rPr>
@@ -8094,7 +8094,7 @@
       <w:pPr>
         <w:pStyle w:val="HTMLPreformatted"/>
         <w:ind w:left="720"/>
-        <w:divId w:val="19162458"/>
+        <w:divId w:val="1249726624"/>
         <w:rPr>
           <w:color w:val="111111"/>
         </w:rPr>
@@ -8110,7 +8110,7 @@
       <w:pPr>
         <w:spacing w:beforeAutospacing="1"/>
         <w:ind w:left="720"/>
-        <w:divId w:val="19162458"/>
+        <w:divId w:val="1249726624"/>
         <w:rPr>
           <w:rFonts w:eastAsia="Times New Roman"/>
           <w:color w:val="111111"/>
@@ -8152,7 +8152,7 @@
           <w:numId w:val="3"/>
         </w:numPr>
         <w:spacing w:before="100" w:beforeAutospacing="1" w:after="75"/>
-        <w:divId w:val="19162458"/>
+        <w:divId w:val="1249726624"/>
         <w:rPr>
           <w:rFonts w:eastAsia="Times New Roman"/>
           <w:color w:val="111111"/>
@@ -8225,7 +8225,7 @@
     <w:p>
       <w:pPr>
         <w:pStyle w:val="Heading3"/>
-        <w:divId w:val="19162458"/>
+        <w:divId w:val="1249726624"/>
         <w:rPr>
           <w:rFonts w:eastAsia="Times New Roman"/>
         </w:rPr>
@@ -8264,7 +8264,7 @@
     <w:p>
       <w:pPr>
         <w:pStyle w:val="NormalWeb"/>
-        <w:divId w:val="19162458"/>
+        <w:divId w:val="1249726624"/>
         <w:rPr>
           <w:color w:val="111111"/>
           <w:sz w:val="26"/>
@@ -8449,7 +8449,7 @@
     <w:p>
       <w:pPr>
         <w:pStyle w:val="NormalWeb"/>
-        <w:divId w:val="19162458"/>
+        <w:divId w:val="1249726624"/>
         <w:rPr>
           <w:color w:val="111111"/>
           <w:sz w:val="26"/>
@@ -8563,7 +8563,7 @@
           <w:numId w:val="4"/>
         </w:numPr>
         <w:spacing w:before="100" w:beforeAutospacing="1" w:after="75"/>
-        <w:divId w:val="19162458"/>
+        <w:divId w:val="1249726624"/>
         <w:rPr>
           <w:rFonts w:eastAsia="Times New Roman"/>
           <w:color w:val="111111"/>
@@ -8607,7 +8607,7 @@
           <w:numId w:val="4"/>
         </w:numPr>
         <w:spacing w:before="100" w:beforeAutospacing="1" w:after="75"/>
-        <w:divId w:val="19162458"/>
+        <w:divId w:val="1249726624"/>
         <w:rPr>
           <w:rFonts w:eastAsia="Times New Roman"/>
           <w:color w:val="111111"/>
@@ -8632,7 +8632,7 @@
           <w:numId w:val="4"/>
         </w:numPr>
         <w:spacing w:before="100" w:beforeAutospacing="1" w:after="75"/>
-        <w:divId w:val="19162458"/>
+        <w:divId w:val="1249726624"/>
         <w:rPr>
           <w:rFonts w:eastAsia="Times New Roman"/>
           <w:color w:val="111111"/>
@@ -8657,7 +8657,7 @@
           <w:numId w:val="4"/>
         </w:numPr>
         <w:spacing w:before="100" w:beforeAutospacing="1" w:after="75"/>
-        <w:divId w:val="19162458"/>
+        <w:divId w:val="1249726624"/>
         <w:rPr>
           <w:rFonts w:eastAsia="Times New Roman"/>
           <w:color w:val="111111"/>
@@ -8682,7 +8682,7 @@
           <w:numId w:val="4"/>
         </w:numPr>
         <w:spacing w:before="100" w:beforeAutospacing="1" w:after="75"/>
-        <w:divId w:val="19162458"/>
+        <w:divId w:val="1249726624"/>
         <w:rPr>
           <w:rFonts w:eastAsia="Times New Roman"/>
           <w:color w:val="111111"/>
@@ -8726,7 +8726,7 @@
           <w:numId w:val="4"/>
         </w:numPr>
         <w:spacing w:before="100" w:beforeAutospacing="1" w:after="75"/>
-        <w:divId w:val="19162458"/>
+        <w:divId w:val="1249726624"/>
         <w:rPr>
           <w:rFonts w:eastAsia="Times New Roman"/>
           <w:color w:val="111111"/>
@@ -8779,7 +8779,7 @@
     <w:p>
       <w:pPr>
         <w:pStyle w:val="Heading3"/>
-        <w:divId w:val="19162458"/>
+        <w:divId w:val="1249726624"/>
         <w:rPr>
           <w:rFonts w:eastAsia="Times New Roman"/>
         </w:rPr>
@@ -8794,7 +8794,7 @@
     <w:p>
       <w:pPr>
         <w:pStyle w:val="NormalWeb"/>
-        <w:divId w:val="19162458"/>
+        <w:divId w:val="1249726624"/>
         <w:rPr>
           <w:color w:val="111111"/>
           <w:sz w:val="26"/>
@@ -8992,7 +8992,7 @@
     <w:p>
       <w:pPr>
         <w:pStyle w:val="NormalWeb"/>
-        <w:divId w:val="19162458"/>
+        <w:divId w:val="1249726624"/>
         <w:rPr>
           <w:color w:val="111111"/>
           <w:sz w:val="26"/>
@@ -9034,7 +9034,7 @@
           <w:numId w:val="5"/>
         </w:numPr>
         <w:spacing w:before="100" w:beforeAutospacing="1" w:after="75"/>
-        <w:divId w:val="19162458"/>
+        <w:divId w:val="1249726624"/>
         <w:rPr>
           <w:rFonts w:eastAsia="Times New Roman"/>
           <w:color w:val="111111"/>
@@ -9107,7 +9107,7 @@
           <w:numId w:val="5"/>
         </w:numPr>
         <w:spacing w:before="100" w:beforeAutospacing="1" w:after="75"/>
-        <w:divId w:val="19162458"/>
+        <w:divId w:val="1249726624"/>
         <w:rPr>
           <w:rFonts w:eastAsia="Times New Roman"/>
           <w:color w:val="111111"/>
@@ -9132,7 +9132,7 @@
           <w:numId w:val="5"/>
         </w:numPr>
         <w:spacing w:before="100" w:beforeAutospacing="1" w:after="75"/>
-        <w:divId w:val="19162458"/>
+        <w:divId w:val="1249726624"/>
         <w:rPr>
           <w:rFonts w:eastAsia="Times New Roman"/>
           <w:color w:val="111111"/>
@@ -9174,7 +9174,7 @@
           <w:numId w:val="5"/>
         </w:numPr>
         <w:spacing w:before="100" w:beforeAutospacing="1" w:after="75"/>
-        <w:divId w:val="19162458"/>
+        <w:divId w:val="1249726624"/>
         <w:rPr>
           <w:rFonts w:eastAsia="Times New Roman"/>
           <w:color w:val="111111"/>
@@ -9227,7 +9227,7 @@
     <w:p>
       <w:pPr>
         <w:pStyle w:val="Heading2"/>
-        <w:divId w:val="19162458"/>
+        <w:divId w:val="1249726624"/>
         <w:rPr>
           <w:rFonts w:eastAsia="Times New Roman"/>
         </w:rPr>
@@ -9242,7 +9242,7 @@
     <w:p>
       <w:pPr>
         <w:pStyle w:val="NormalWeb"/>
-        <w:divId w:val="19162458"/>
+        <w:divId w:val="1249726624"/>
         <w:rPr>
           <w:color w:val="111111"/>
           <w:sz w:val="26"/>
@@ -9487,7 +9487,7 @@
     <w:p>
       <w:pPr>
         <w:pStyle w:val="HTMLPreformatted"/>
-        <w:divId w:val="19162458"/>
+        <w:divId w:val="1249726624"/>
         <w:rPr>
           <w:color w:val="111111"/>
         </w:rPr>
@@ -9496,7 +9496,7 @@
     <w:p>
       <w:pPr>
         <w:pStyle w:val="HTMLPreformatted"/>
-        <w:divId w:val="19162458"/>
+        <w:divId w:val="1249726624"/>
         <w:rPr>
           <w:color w:val="111111"/>
         </w:rPr>
@@ -9511,7 +9511,7 @@
     <w:p>
       <w:pPr>
         <w:pStyle w:val="HTMLPreformatted"/>
-        <w:divId w:val="19162458"/>
+        <w:divId w:val="1249726624"/>
         <w:rPr>
           <w:color w:val="111111"/>
         </w:rPr>
@@ -9640,7 +9640,7 @@
     <w:p>
       <w:pPr>
         <w:pStyle w:val="HTMLPreformatted"/>
-        <w:divId w:val="19162458"/>
+        <w:divId w:val="1249726624"/>
         <w:rPr>
           <w:color w:val="111111"/>
         </w:rPr>
@@ -9703,7 +9703,7 @@
     <w:p>
       <w:pPr>
         <w:pStyle w:val="HTMLPreformatted"/>
-        <w:divId w:val="19162458"/>
+        <w:divId w:val="1249726624"/>
         <w:rPr>
           <w:color w:val="111111"/>
         </w:rPr>
@@ -9718,7 +9718,7 @@
     <w:p>
       <w:pPr>
         <w:pStyle w:val="HTMLPreformatted"/>
-        <w:divId w:val="19162458"/>
+        <w:divId w:val="1249726624"/>
         <w:rPr>
           <w:color w:val="111111"/>
         </w:rPr>
@@ -9727,7 +9727,7 @@
     <w:p>
       <w:pPr>
         <w:pStyle w:val="HTMLPreformatted"/>
-        <w:divId w:val="19162458"/>
+        <w:divId w:val="1249726624"/>
         <w:rPr>
           <w:color w:val="111111"/>
         </w:rPr>
@@ -9850,7 +9850,7 @@
     <w:p>
       <w:pPr>
         <w:pStyle w:val="HTMLPreformatted"/>
-        <w:divId w:val="19162458"/>
+        <w:divId w:val="1249726624"/>
         <w:rPr>
           <w:color w:val="111111"/>
         </w:rPr>
@@ -9925,7 +9925,7 @@
     <w:p>
       <w:pPr>
         <w:pStyle w:val="HTMLPreformatted"/>
-        <w:divId w:val="19162458"/>
+        <w:divId w:val="1249726624"/>
         <w:rPr>
           <w:color w:val="111111"/>
         </w:rPr>
@@ -9934,7 +9934,7 @@
     <w:p>
       <w:pPr>
         <w:pStyle w:val="HTMLPreformatted"/>
-        <w:divId w:val="19162458"/>
+        <w:divId w:val="1249726624"/>
         <w:rPr>
           <w:color w:val="111111"/>
         </w:rPr>
@@ -9949,7 +9949,7 @@
     <w:p>
       <w:pPr>
         <w:pStyle w:val="HTMLPreformatted"/>
-        <w:divId w:val="19162458"/>
+        <w:divId w:val="1249726624"/>
         <w:rPr>
           <w:color w:val="111111"/>
         </w:rPr>
@@ -10012,7 +10012,7 @@
     <w:p>
       <w:pPr>
         <w:pStyle w:val="HTMLPreformatted"/>
-        <w:divId w:val="19162458"/>
+        <w:divId w:val="1249726624"/>
         <w:rPr>
           <w:color w:val="111111"/>
         </w:rPr>
@@ -10027,7 +10027,7 @@
     <w:p>
       <w:pPr>
         <w:pStyle w:val="HTMLPreformatted"/>
-        <w:divId w:val="19162458"/>
+        <w:divId w:val="1249726624"/>
         <w:rPr>
           <w:color w:val="111111"/>
         </w:rPr>
@@ -10078,7 +10078,7 @@
     <w:p>
       <w:pPr>
         <w:pStyle w:val="HTMLPreformatted"/>
-        <w:divId w:val="19162458"/>
+        <w:divId w:val="1249726624"/>
         <w:rPr>
           <w:color w:val="111111"/>
         </w:rPr>
@@ -10117,7 +10117,7 @@
     <w:p>
       <w:pPr>
         <w:pStyle w:val="HTMLPreformatted"/>
-        <w:divId w:val="19162458"/>
+        <w:divId w:val="1249726624"/>
         <w:rPr>
           <w:color w:val="111111"/>
         </w:rPr>
@@ -10126,7 +10126,7 @@
     <w:p>
       <w:pPr>
         <w:pStyle w:val="HTMLPreformatted"/>
-        <w:divId w:val="19162458"/>
+        <w:divId w:val="1249726624"/>
         <w:rPr>
           <w:color w:val="111111"/>
         </w:rPr>
@@ -10141,7 +10141,7 @@
     <w:p>
       <w:pPr>
         <w:pStyle w:val="HTMLPreformatted"/>
-        <w:divId w:val="19162458"/>
+        <w:divId w:val="1249726624"/>
         <w:rPr>
           <w:color w:val="111111"/>
         </w:rPr>
@@ -10252,7 +10252,7 @@
     <w:p>
       <w:pPr>
         <w:pStyle w:val="HTMLPreformatted"/>
-        <w:divId w:val="19162458"/>
+        <w:divId w:val="1249726624"/>
         <w:rPr>
           <w:color w:val="111111"/>
         </w:rPr>
@@ -10267,7 +10267,7 @@
     <w:p>
       <w:pPr>
         <w:pStyle w:val="HTMLPreformatted"/>
-        <w:divId w:val="19162458"/>
+        <w:divId w:val="1249726624"/>
         <w:rPr>
           <w:color w:val="111111"/>
         </w:rPr>
@@ -10360,7 +10360,7 @@
     <w:p>
       <w:pPr>
         <w:pStyle w:val="HTMLPreformatted"/>
-        <w:divId w:val="19162458"/>
+        <w:divId w:val="1249726624"/>
         <w:rPr>
           <w:color w:val="111111"/>
         </w:rPr>
@@ -10531,7 +10531,7 @@
     <w:p>
       <w:pPr>
         <w:pStyle w:val="HTMLPreformatted"/>
-        <w:divId w:val="19162458"/>
+        <w:divId w:val="1249726624"/>
         <w:rPr>
           <w:color w:val="111111"/>
         </w:rPr>
@@ -10540,7 +10540,7 @@
     <w:p>
       <w:pPr>
         <w:pStyle w:val="HTMLPreformatted"/>
-        <w:divId w:val="19162458"/>
+        <w:divId w:val="1249726624"/>
         <w:rPr>
           <w:color w:val="111111"/>
         </w:rPr>
@@ -10555,7 +10555,7 @@
     <w:p>
       <w:pPr>
         <w:pStyle w:val="HTMLPreformatted"/>
-        <w:divId w:val="19162458"/>
+        <w:divId w:val="1249726624"/>
         <w:rPr>
           <w:color w:val="111111"/>
         </w:rPr>
@@ -10618,7 +10618,7 @@
     <w:p>
       <w:pPr>
         <w:pStyle w:val="HTMLPreformatted"/>
-        <w:divId w:val="19162458"/>
+        <w:divId w:val="1249726624"/>
         <w:rPr>
           <w:color w:val="111111"/>
         </w:rPr>
@@ -10633,7 +10633,7 @@
     <w:p>
       <w:pPr>
         <w:pStyle w:val="HTMLPreformatted"/>
-        <w:divId w:val="19162458"/>
+        <w:divId w:val="1249726624"/>
         <w:rPr>
           <w:color w:val="111111"/>
         </w:rPr>
@@ -10642,7 +10642,7 @@
     <w:p>
       <w:pPr>
         <w:pStyle w:val="HTMLPreformatted"/>
-        <w:divId w:val="19162458"/>
+        <w:divId w:val="1249726624"/>
         <w:rPr>
           <w:color w:val="111111"/>
         </w:rPr>
@@ -10754,7 +10754,7 @@
     <w:p>
       <w:pPr>
         <w:pStyle w:val="HTMLPreformatted"/>
-        <w:divId w:val="19162458"/>
+        <w:divId w:val="1249726624"/>
         <w:rPr>
           <w:color w:val="111111"/>
         </w:rPr>
@@ -10811,7 +10811,7 @@
     <w:p>
       <w:pPr>
         <w:pStyle w:val="HTMLPreformatted"/>
-        <w:divId w:val="19162458"/>
+        <w:divId w:val="1249726624"/>
         <w:rPr>
           <w:color w:val="111111"/>
         </w:rPr>
@@ -10898,7 +10898,7 @@
     <w:p>
       <w:pPr>
         <w:pStyle w:val="HTMLPreformatted"/>
-        <w:divId w:val="19162458"/>
+        <w:divId w:val="1249726624"/>
         <w:rPr>
           <w:color w:val="111111"/>
         </w:rPr>
@@ -10985,7 +10985,7 @@
     <w:p>
       <w:pPr>
         <w:pStyle w:val="HTMLPreformatted"/>
-        <w:divId w:val="19162458"/>
+        <w:divId w:val="1249726624"/>
         <w:rPr>
           <w:color w:val="111111"/>
         </w:rPr>
@@ -10994,7 +10994,7 @@
     <w:p>
       <w:pPr>
         <w:pStyle w:val="HTMLPreformatted"/>
-        <w:divId w:val="19162458"/>
+        <w:divId w:val="1249726624"/>
         <w:rPr>
           <w:color w:val="111111"/>
         </w:rPr>
@@ -11093,7 +11093,7 @@
     <w:p>
       <w:pPr>
         <w:pStyle w:val="HTMLPreformatted"/>
-        <w:divId w:val="19162458"/>
+        <w:divId w:val="1249726624"/>
         <w:rPr>
           <w:color w:val="111111"/>
         </w:rPr>
@@ -11144,7 +11144,7 @@
     <w:p>
       <w:pPr>
         <w:pStyle w:val="HTMLPreformatted"/>
-        <w:divId w:val="19162458"/>
+        <w:divId w:val="1249726624"/>
         <w:rPr>
           <w:color w:val="111111"/>
         </w:rPr>
@@ -11273,7 +11273,7 @@
     <w:p>
       <w:pPr>
         <w:pStyle w:val="HTMLPreformatted"/>
-        <w:divId w:val="19162458"/>
+        <w:divId w:val="1249726624"/>
         <w:rPr>
           <w:color w:val="111111"/>
         </w:rPr>
@@ -11282,7 +11282,7 @@
     <w:p>
       <w:pPr>
         <w:pStyle w:val="HTMLPreformatted"/>
-        <w:divId w:val="19162458"/>
+        <w:divId w:val="1249726624"/>
         <w:rPr>
           <w:color w:val="111111"/>
         </w:rPr>
@@ -11297,7 +11297,7 @@
     <w:p>
       <w:pPr>
         <w:pStyle w:val="HTMLPreformatted"/>
-        <w:divId w:val="19162458"/>
+        <w:divId w:val="1249726624"/>
         <w:rPr>
           <w:color w:val="111111"/>
         </w:rPr>
@@ -11384,7 +11384,7 @@
     <w:p>
       <w:pPr>
         <w:pStyle w:val="HTMLPreformatted"/>
-        <w:divId w:val="19162458"/>
+        <w:divId w:val="1249726624"/>
         <w:rPr>
           <w:color w:val="111111"/>
         </w:rPr>
@@ -11399,7 +11399,7 @@
     <w:p>
       <w:pPr>
         <w:pStyle w:val="HTMLPreformatted"/>
-        <w:divId w:val="19162458"/>
+        <w:divId w:val="1249726624"/>
         <w:rPr>
           <w:color w:val="111111"/>
         </w:rPr>
@@ -11408,7 +11408,7 @@
     <w:p>
       <w:pPr>
         <w:pStyle w:val="HTMLPreformatted"/>
-        <w:divId w:val="19162458"/>
+        <w:divId w:val="1249726624"/>
         <w:rPr>
           <w:color w:val="111111"/>
         </w:rPr>
@@ -11483,7 +11483,7 @@
     <w:p>
       <w:pPr>
         <w:pStyle w:val="HTMLPreformatted"/>
-        <w:divId w:val="19162458"/>
+        <w:divId w:val="1249726624"/>
         <w:rPr>
           <w:color w:val="111111"/>
         </w:rPr>
@@ -11504,7 +11504,7 @@
     <w:p>
       <w:pPr>
         <w:pStyle w:val="HTMLPreformatted"/>
-        <w:divId w:val="19162458"/>
+        <w:divId w:val="1249726624"/>
         <w:rPr>
           <w:color w:val="111111"/>
         </w:rPr>
@@ -11519,7 +11519,7 @@
     <w:p>
       <w:pPr>
         <w:pStyle w:val="HTMLPreformatted"/>
-        <w:divId w:val="19162458"/>
+        <w:divId w:val="1249726624"/>
         <w:rPr>
           <w:color w:val="111111"/>
         </w:rPr>
@@ -11534,7 +11534,7 @@
     <w:p>
       <w:pPr>
         <w:pStyle w:val="HTMLPreformatted"/>
-        <w:divId w:val="19162458"/>
+        <w:divId w:val="1249726624"/>
         <w:rPr>
           <w:color w:val="111111"/>
         </w:rPr>
@@ -11561,7 +11561,7 @@
     <w:p>
       <w:pPr>
         <w:pStyle w:val="HTMLPreformatted"/>
-        <w:divId w:val="19162458"/>
+        <w:divId w:val="1249726624"/>
         <w:rPr>
           <w:color w:val="111111"/>
         </w:rPr>
@@ -11570,7 +11570,7 @@
     <w:p>
       <w:pPr>
         <w:pStyle w:val="HTMLPreformatted"/>
-        <w:divId w:val="19162458"/>
+        <w:divId w:val="1249726624"/>
         <w:rPr>
           <w:color w:val="111111"/>
         </w:rPr>
@@ -11633,7 +11633,7 @@
     <w:p>
       <w:pPr>
         <w:pStyle w:val="HTMLPreformatted"/>
-        <w:divId w:val="19162458"/>
+        <w:divId w:val="1249726624"/>
         <w:rPr>
           <w:color w:val="111111"/>
         </w:rPr>
@@ -11648,7 +11648,7 @@
     <w:p>
       <w:pPr>
         <w:pStyle w:val="HTMLPreformatted"/>
-        <w:divId w:val="19162458"/>
+        <w:divId w:val="1249726624"/>
         <w:rPr>
           <w:color w:val="111111"/>
         </w:rPr>
@@ -11663,7 +11663,7 @@
     <w:p>
       <w:pPr>
         <w:pStyle w:val="HTMLPreformatted"/>
-        <w:divId w:val="19162458"/>
+        <w:divId w:val="1249726624"/>
         <w:rPr>
           <w:color w:val="111111"/>
         </w:rPr>
@@ -11690,7 +11690,7 @@
     <w:p>
       <w:pPr>
         <w:pStyle w:val="HTMLPreformatted"/>
-        <w:divId w:val="19162458"/>
+        <w:divId w:val="1249726624"/>
         <w:rPr>
           <w:color w:val="111111"/>
         </w:rPr>
@@ -11699,7 +11699,7 @@
     <w:p>
       <w:pPr>
         <w:pStyle w:val="HTMLPreformatted"/>
-        <w:divId w:val="19162458"/>
+        <w:divId w:val="1249726624"/>
         <w:rPr>
           <w:color w:val="111111"/>
         </w:rPr>
@@ -11780,7 +11780,7 @@
     <w:p>
       <w:pPr>
         <w:pStyle w:val="HTMLPreformatted"/>
-        <w:divId w:val="19162458"/>
+        <w:divId w:val="1249726624"/>
         <w:rPr>
           <w:color w:val="111111"/>
         </w:rPr>
@@ -11789,7 +11789,7 @@
     <w:p>
       <w:pPr>
         <w:pStyle w:val="HTMLPreformatted"/>
-        <w:divId w:val="19162458"/>
+        <w:divId w:val="1249726624"/>
         <w:rPr>
           <w:color w:val="111111"/>
         </w:rPr>
@@ -11804,7 +11804,7 @@
     <w:p>
       <w:pPr>
         <w:pStyle w:val="HTMLPreformatted"/>
-        <w:divId w:val="19162458"/>
+        <w:divId w:val="1249726624"/>
         <w:rPr>
           <w:color w:val="111111"/>
         </w:rPr>
@@ -11891,7 +11891,7 @@
     <w:p>
       <w:pPr>
         <w:pStyle w:val="HTMLPreformatted"/>
-        <w:divId w:val="19162458"/>
+        <w:divId w:val="1249726624"/>
         <w:rPr>
           <w:color w:val="111111"/>
         </w:rPr>
@@ -11906,7 +11906,7 @@
     <w:p>
       <w:pPr>
         <w:pStyle w:val="HTMLPreformatted"/>
-        <w:divId w:val="19162458"/>
+        <w:divId w:val="1249726624"/>
         <w:rPr>
           <w:color w:val="111111"/>
         </w:rPr>
@@ -11915,7 +11915,7 @@
     <w:p>
       <w:pPr>
         <w:pStyle w:val="HTMLPreformatted"/>
-        <w:divId w:val="19162458"/>
+        <w:divId w:val="1249726624"/>
         <w:rPr>
           <w:color w:val="111111"/>
         </w:rPr>
@@ -12014,7 +12014,7 @@
     <w:p>
       <w:pPr>
         <w:pStyle w:val="HTMLPreformatted"/>
-        <w:divId w:val="19162458"/>
+        <w:divId w:val="1249726624"/>
         <w:rPr>
           <w:color w:val="111111"/>
         </w:rPr>
@@ -12054,7 +12054,7 @@
     <w:p>
       <w:pPr>
         <w:pStyle w:val="HTMLPreformatted"/>
-        <w:divId w:val="19162458"/>
+        <w:divId w:val="1249726624"/>
         <w:rPr>
           <w:color w:val="111111"/>
         </w:rPr>
@@ -12093,7 +12093,7 @@
     <w:p>
       <w:pPr>
         <w:pStyle w:val="HTMLPreformatted"/>
-        <w:divId w:val="19162458"/>
+        <w:divId w:val="1249726624"/>
         <w:rPr>
           <w:color w:val="111111"/>
         </w:rPr>
@@ -12102,7 +12102,7 @@
     <w:p>
       <w:pPr>
         <w:pStyle w:val="HTMLPreformatted"/>
-        <w:divId w:val="19162458"/>
+        <w:divId w:val="1249726624"/>
         <w:rPr>
           <w:color w:val="111111"/>
         </w:rPr>
@@ -12189,7 +12189,7 @@
     <w:p>
       <w:pPr>
         <w:pStyle w:val="HTMLPreformatted"/>
-        <w:divId w:val="19162458"/>
+        <w:divId w:val="1249726624"/>
         <w:rPr>
           <w:color w:val="111111"/>
         </w:rPr>
@@ -12216,7 +12216,7 @@
     <w:p>
       <w:pPr>
         <w:pStyle w:val="HTMLPreformatted"/>
-        <w:divId w:val="19162458"/>
+        <w:divId w:val="1249726624"/>
         <w:rPr>
           <w:color w:val="111111"/>
         </w:rPr>
@@ -12225,7 +12225,7 @@
     <w:p>
       <w:pPr>
         <w:pStyle w:val="HTMLPreformatted"/>
-        <w:divId w:val="19162458"/>
+        <w:divId w:val="1249726624"/>
         <w:rPr>
           <w:color w:val="111111"/>
         </w:rPr>
@@ -12240,7 +12240,7 @@
     <w:p>
       <w:pPr>
         <w:pStyle w:val="HTMLPreformatted"/>
-        <w:divId w:val="19162458"/>
+        <w:divId w:val="1249726624"/>
         <w:rPr>
           <w:color w:val="111111"/>
         </w:rPr>
@@ -12327,7 +12327,7 @@
     <w:p>
       <w:pPr>
         <w:pStyle w:val="HTMLPreformatted"/>
-        <w:divId w:val="19162458"/>
+        <w:divId w:val="1249726624"/>
         <w:rPr>
           <w:color w:val="111111"/>
         </w:rPr>
@@ -12342,7 +12342,7 @@
     <w:p>
       <w:pPr>
         <w:pStyle w:val="HTMLPreformatted"/>
-        <w:divId w:val="19162458"/>
+        <w:divId w:val="1249726624"/>
         <w:rPr>
           <w:color w:val="111111"/>
         </w:rPr>
@@ -12405,7 +12405,7 @@
     <w:p>
       <w:pPr>
         <w:pStyle w:val="HTMLPreformatted"/>
-        <w:divId w:val="19162458"/>
+        <w:divId w:val="1249726624"/>
         <w:rPr>
           <w:color w:val="111111"/>
         </w:rPr>
@@ -12456,7 +12456,7 @@
     <w:p>
       <w:pPr>
         <w:pStyle w:val="HTMLPreformatted"/>
-        <w:divId w:val="19162458"/>
+        <w:divId w:val="1249726624"/>
         <w:rPr>
           <w:color w:val="111111"/>
         </w:rPr>
@@ -12525,7 +12525,7 @@
     <w:p>
       <w:pPr>
         <w:pStyle w:val="HTMLPreformatted"/>
-        <w:divId w:val="19162458"/>
+        <w:divId w:val="1249726624"/>
         <w:rPr>
           <w:color w:val="111111"/>
         </w:rPr>
@@ -12576,7 +12576,7 @@
     <w:p>
       <w:pPr>
         <w:pStyle w:val="HTMLPreformatted"/>
-        <w:divId w:val="19162458"/>
+        <w:divId w:val="1249726624"/>
         <w:rPr>
           <w:color w:val="111111"/>
         </w:rPr>
@@ -12639,7 +12639,7 @@
     <w:p>
       <w:pPr>
         <w:pStyle w:val="HTMLPreformatted"/>
-        <w:divId w:val="19162458"/>
+        <w:divId w:val="1249726624"/>
         <w:rPr>
           <w:color w:val="111111"/>
         </w:rPr>
@@ -12690,7 +12690,7 @@
     <w:p>
       <w:pPr>
         <w:pStyle w:val="HTMLPreformatted"/>
-        <w:divId w:val="19162458"/>
+        <w:divId w:val="1249726624"/>
         <w:rPr>
           <w:color w:val="111111"/>
         </w:rPr>
@@ -12699,7 +12699,7 @@
     <w:p>
       <w:pPr>
         <w:pStyle w:val="HTMLPreformatted"/>
-        <w:divId w:val="19162458"/>
+        <w:divId w:val="1249726624"/>
         <w:rPr>
           <w:color w:val="111111"/>
         </w:rPr>
@@ -12834,7 +12834,7 @@
     <w:p>
       <w:pPr>
         <w:pStyle w:val="HTMLPreformatted"/>
-        <w:divId w:val="19162458"/>
+        <w:divId w:val="1249726624"/>
         <w:rPr>
           <w:color w:val="111111"/>
         </w:rPr>
@@ -12993,7 +12993,7 @@
     <w:p>
       <w:pPr>
         <w:pStyle w:val="HTMLPreformatted"/>
-        <w:divId w:val="19162458"/>
+        <w:divId w:val="1249726624"/>
         <w:rPr>
           <w:color w:val="111111"/>
         </w:rPr>
@@ -13002,7 +13002,7 @@
     <w:p>
       <w:pPr>
         <w:pStyle w:val="HTMLPreformatted"/>
-        <w:divId w:val="19162458"/>
+        <w:divId w:val="1249726624"/>
         <w:rPr>
           <w:color w:val="111111"/>
         </w:rPr>
@@ -13017,7 +13017,7 @@
     <w:p>
       <w:pPr>
         <w:pStyle w:val="HTMLPreformatted"/>
-        <w:divId w:val="19162458"/>
+        <w:divId w:val="1249726624"/>
         <w:rPr>
           <w:color w:val="111111"/>
         </w:rPr>
@@ -13080,7 +13080,7 @@
     <w:p>
       <w:pPr>
         <w:pStyle w:val="HTMLPreformatted"/>
-        <w:divId w:val="19162458"/>
+        <w:divId w:val="1249726624"/>
         <w:rPr>
           <w:color w:val="111111"/>
         </w:rPr>
@@ -13095,7 +13095,7 @@
     <w:p>
       <w:pPr>
         <w:pStyle w:val="HTMLPreformatted"/>
-        <w:divId w:val="19162458"/>
+        <w:divId w:val="1249726624"/>
         <w:rPr>
           <w:color w:val="111111"/>
         </w:rPr>
@@ -13182,7 +13182,7 @@
     <w:p>
       <w:pPr>
         <w:pStyle w:val="HTMLPreformatted"/>
-        <w:divId w:val="19162458"/>
+        <w:divId w:val="1249726624"/>
         <w:rPr>
           <w:color w:val="111111"/>
         </w:rPr>
@@ -13371,7 +13371,7 @@
     <w:p>
       <w:pPr>
         <w:pStyle w:val="HTMLPreformatted"/>
-        <w:divId w:val="19162458"/>
+        <w:divId w:val="1249726624"/>
         <w:rPr>
           <w:color w:val="111111"/>
         </w:rPr>
@@ -13590,7 +13590,7 @@
     <w:p>
       <w:pPr>
         <w:pStyle w:val="HTMLPreformatted"/>
-        <w:divId w:val="19162458"/>
+        <w:divId w:val="1249726624"/>
         <w:rPr>
           <w:color w:val="111111"/>
         </w:rPr>
@@ -13779,7 +13779,7 @@
     <w:p>
       <w:pPr>
         <w:pStyle w:val="HTMLPreformatted"/>
-        <w:divId w:val="19162458"/>
+        <w:divId w:val="1249726624"/>
         <w:rPr>
           <w:color w:val="111111"/>
         </w:rPr>
@@ -13788,7 +13788,7 @@
     <w:p>
       <w:pPr>
         <w:pStyle w:val="HTMLPreformatted"/>
-        <w:divId w:val="19162458"/>
+        <w:divId w:val="1249726624"/>
         <w:rPr>
           <w:color w:val="111111"/>
         </w:rPr>
@@ -13923,7 +13923,7 @@
     <w:p>
       <w:pPr>
         <w:pStyle w:val="HTMLPreformatted"/>
-        <w:divId w:val="19162458"/>
+        <w:divId w:val="1249726624"/>
         <w:rPr>
           <w:color w:val="111111"/>
         </w:rPr>
@@ -13938,7 +13938,7 @@
     <w:p>
       <w:pPr>
         <w:pStyle w:val="HTMLPreformatted"/>
-        <w:divId w:val="19162458"/>
+        <w:divId w:val="1249726624"/>
         <w:rPr>
           <w:color w:val="111111"/>
         </w:rPr>
@@ -14032,7 +14032,7 @@
     <w:p>
       <w:pPr>
         <w:pStyle w:val="HTMLPreformatted"/>
-        <w:divId w:val="19162458"/>
+        <w:divId w:val="1249726624"/>
         <w:rPr>
           <w:color w:val="111111"/>
         </w:rPr>
@@ -14041,7 +14041,7 @@
     <w:p>
       <w:pPr>
         <w:pStyle w:val="HTMLPreformatted"/>
-        <w:divId w:val="19162458"/>
+        <w:divId w:val="1249726624"/>
         <w:rPr>
           <w:color w:val="111111"/>
         </w:rPr>
@@ -14056,7 +14056,7 @@
     <w:p>
       <w:pPr>
         <w:pStyle w:val="HTMLPreformatted"/>
-        <w:divId w:val="19162458"/>
+        <w:divId w:val="1249726624"/>
         <w:rPr>
           <w:color w:val="111111"/>
         </w:rPr>
@@ -14167,7 +14167,7 @@
     <w:p>
       <w:pPr>
         <w:pStyle w:val="HTMLPreformatted"/>
-        <w:divId w:val="19162458"/>
+        <w:divId w:val="1249726624"/>
         <w:rPr>
           <w:color w:val="111111"/>
         </w:rPr>
@@ -14182,7 +14182,7 @@
     <w:p>
       <w:pPr>
         <w:pStyle w:val="Heading2"/>
-        <w:divId w:val="19162458"/>
+        <w:divId w:val="1249726624"/>
         <w:rPr>
           <w:rFonts w:eastAsia="Times New Roman"/>
         </w:rPr>
@@ -14197,7 +14197,7 @@
     <w:p>
       <w:pPr>
         <w:pStyle w:val="NormalWeb"/>
-        <w:divId w:val="19162458"/>
+        <w:divId w:val="1249726624"/>
         <w:rPr>
           <w:color w:val="111111"/>
           <w:sz w:val="26"/>
@@ -14252,7 +14252,7 @@
           <w:numId w:val="6"/>
         </w:numPr>
         <w:spacing w:before="100" w:beforeAutospacing="1" w:after="75"/>
-        <w:divId w:val="19162458"/>
+        <w:divId w:val="1249726624"/>
         <w:rPr>
           <w:rFonts w:eastAsia="Times New Roman"/>
           <w:color w:val="111111"/>
@@ -14287,7 +14287,7 @@
           <w:numId w:val="6"/>
         </w:numPr>
         <w:spacing w:before="100" w:beforeAutospacing="1" w:after="75"/>
-        <w:divId w:val="19162458"/>
+        <w:divId w:val="1249726624"/>
         <w:rPr>
           <w:rFonts w:eastAsia="Times New Roman"/>
           <w:color w:val="111111"/>
@@ -14329,7 +14329,7 @@
           <w:numId w:val="6"/>
         </w:numPr>
         <w:spacing w:before="100" w:beforeAutospacing="1" w:after="75"/>
-        <w:divId w:val="19162458"/>
+        <w:divId w:val="1249726624"/>
         <w:rPr>
           <w:rFonts w:eastAsia="Times New Roman"/>
           <w:color w:val="111111"/>
@@ -14371,7 +14371,7 @@
           <w:numId w:val="6"/>
         </w:numPr>
         <w:spacing w:before="100" w:beforeAutospacing="1" w:after="75"/>
-        <w:divId w:val="19162458"/>
+        <w:divId w:val="1249726624"/>
         <w:rPr>
           <w:rFonts w:eastAsia="Times New Roman"/>
           <w:color w:val="111111"/>
@@ -14413,7 +14413,7 @@
           <w:numId w:val="6"/>
         </w:numPr>
         <w:spacing w:before="100" w:beforeAutospacing="1" w:after="75"/>
-        <w:divId w:val="19162458"/>
+        <w:divId w:val="1249726624"/>
         <w:rPr>
           <w:rFonts w:eastAsia="Times New Roman"/>
           <w:color w:val="111111"/>
@@ -14455,7 +14455,7 @@
           <w:numId w:val="6"/>
         </w:numPr>
         <w:spacing w:before="100" w:beforeAutospacing="1" w:after="75"/>
-        <w:divId w:val="19162458"/>
+        <w:divId w:val="1249726624"/>
         <w:rPr>
           <w:rFonts w:eastAsia="Times New Roman"/>
           <w:color w:val="111111"/>
@@ -14497,7 +14497,7 @@
           <w:numId w:val="6"/>
         </w:numPr>
         <w:spacing w:before="100" w:beforeAutospacing="1" w:after="75"/>
-        <w:divId w:val="19162458"/>
+        <w:divId w:val="1249726624"/>
         <w:rPr>
           <w:rFonts w:eastAsia="Times New Roman"/>
           <w:color w:val="111111"/>
@@ -14532,7 +14532,7 @@
           <w:numId w:val="6"/>
         </w:numPr>
         <w:spacing w:before="100" w:beforeAutospacing="1" w:after="75"/>
-        <w:divId w:val="19162458"/>
+        <w:divId w:val="1249726624"/>
         <w:rPr>
           <w:rFonts w:eastAsia="Times New Roman"/>
           <w:color w:val="111111"/>
@@ -14615,7 +14615,7 @@
           <w:numId w:val="6"/>
         </w:numPr>
         <w:spacing w:before="100" w:beforeAutospacing="1" w:after="75"/>
-        <w:divId w:val="19162458"/>
+        <w:divId w:val="1249726624"/>
         <w:rPr>
           <w:rFonts w:eastAsia="Times New Roman"/>
           <w:color w:val="111111"/>
@@ -14682,7 +14682,7 @@
           <w:numId w:val="6"/>
         </w:numPr>
         <w:spacing w:before="100" w:beforeAutospacing="1" w:after="75"/>
-        <w:divId w:val="19162458"/>
+        <w:divId w:val="1249726624"/>
         <w:rPr>
           <w:rFonts w:eastAsia="Times New Roman"/>
           <w:color w:val="111111"/>
@@ -14732,9 +14732,424 @@
 <file path=word/numbering.xml><?xml version="1.0" encoding="utf-8"?>
 <w:numbering xmlns:wpc="http://schemas.microsoft.com/office/word/2010/wordprocessingCanvas" xmlns:cx="http://schemas.microsoft.com/office/drawing/2014/chartex" xmlns:cx1="http://schemas.microsoft.com/office/drawing/2015/9/8/chartex" xmlns:cx2="http://schemas.microsoft.com/office/drawing/2015/10/21/chartex" xmlns:cx3="http://schemas.microsoft.com/office/drawing/2016/5/9/chartex" xmlns:cx4="http://schemas.microsoft.com/office/drawing/2016/5/10/chartex" xmlns:cx5="http://schemas.microsoft.com/office/drawing/2016/5/11/chartex" xmlns:cx6="http://schemas.microsoft.com/office/drawing/2016/5/12/chartex" xmlns:cx7="http://schemas.microsoft.com/office/drawing/2016/5/13/chartex" xmlns:cx8="http://schemas.microsoft.com/office/drawing/2016/5/14/chartex" xmlns:mc="http://schemas.openxmlformats.org/markup-compatibility/2006" xmlns:aink="http://schemas.microsoft.com/office/drawing/2016/ink" xmlns:am3d="http://schemas.microsoft.com/office/drawing/2017/model3d" xmlns:o="urn:schemas-microsoft-com:office:office" xmlns:oel="http://schemas.microsoft.com/office/2019/extlst" xmlns:r="http://schemas.openxmlformats.org/officeDocument/2006/relationships" xmlns:m="http://schemas.openxmlformats.org/officeDocument/2006/math" xmlns:v="urn:schemas-microsoft-com:vml" xmlns:wp14="http://schemas.microsoft.com/office/word/2010/wordprocessingDrawing" xmlns:wp="http://schemas.openxmlformats.org/drawingml/2006/wordprocessingDrawing" xmlns:w10="urn:schemas-microsoft-com:office:word" xmlns:w="http://schemas.openxmlformats.org/wordprocessingml/2006/main" xmlns:w14="http://schemas.microsoft.com/office/word/2010/wordml" xmlns:w15="http://schemas.microsoft.com/office/word/2012/wordml" xmlns:w16cex="http://schemas.microsoft.com/office/word/2018/wordml/cex" xmlns:w16cid="http://schemas.microsoft.com/office/word/2016/wordml/cid" xmlns:w16="http://schemas.microsoft.com/office/word/2018/wordml" xmlns:w16du="http://schemas.microsoft.com/office/word/2023/wordml/word16du" xmlns:w16sdtdh="http://schemas.microsoft.com/office/word/2020/wordml/sdtdatahash" xmlns:w16sdtfl="http://schemas.microsoft.com/office/word/2024/wordml/sdtformatlock" xmlns:w16se="http://schemas.microsoft.com/office/word/2015/wordml/symex" xmlns:wpg="http://schemas.microsoft.com/office/word/2010/wordprocessingGroup" xmlns:wpi="http://schemas.microsoft.com/office/word/2010/wordprocessingInk" xmlns:wne="http://schemas.microsoft.com/office/word/2006/wordml" xmlns:wps="http://schemas.microsoft.com/office/word/2010/wordprocessingShape" mc:Ignorable="w14 w15 w16se w16cid w16 w16cex w16sdtdh w16sdtfl w16du wp14">
   <w:abstractNum w:abstractNumId="0" w15:restartNumberingAfterBreak="0">
-    <w:nsid w:val="006B24F9"/>
+    <w:nsid w:val="0EAF0D1D"/>
     <w:multiLevelType w:val="multilevel"/>
-    <w:tmpl w:val="4D02A738"/>
+    <w:tmpl w:val="6596B980"/>
+    <w:lvl w:ilvl="0">
+      <w:start w:val="1"/>
+      <w:numFmt w:val="bullet"/>
+      <w:lvlText w:val=""/>
+      <w:lvlJc w:val="left"/>
+      <w:pPr>
+        <w:tabs>
+          <w:tab w:val="num" w:pos="720"/>
+        </w:tabs>
+        <w:ind w:left="720" w:hanging="360"/>
+      </w:pPr>
+      <w:rPr>
+        <w:rFonts w:ascii="Symbol" w:hAnsi="Symbol" w:hint="default"/>
+        <w:sz w:val="20"/>
+      </w:rPr>
+    </w:lvl>
+    <w:lvl w:ilvl="1">
+      <w:start w:val="1"/>
+      <w:numFmt w:val="bullet"/>
+      <w:lvlText w:val="o"/>
+      <w:lvlJc w:val="left"/>
+      <w:pPr>
+        <w:tabs>
+          <w:tab w:val="num" w:pos="1440"/>
+        </w:tabs>
+        <w:ind w:left="1440" w:hanging="360"/>
+      </w:pPr>
+      <w:rPr>
+        <w:rFonts w:ascii="Courier New" w:hAnsi="Courier New" w:hint="default"/>
+        <w:sz w:val="20"/>
+      </w:rPr>
+    </w:lvl>
+    <w:lvl w:ilvl="2" w:tentative="1">
+      <w:start w:val="1"/>
+      <w:numFmt w:val="bullet"/>
+      <w:lvlText w:val=""/>
+      <w:lvlJc w:val="left"/>
+      <w:pPr>
+        <w:tabs>
+          <w:tab w:val="num" w:pos="2160"/>
+        </w:tabs>
+        <w:ind w:left="2160" w:hanging="360"/>
+      </w:pPr>
+      <w:rPr>
+        <w:rFonts w:ascii="Wingdings" w:hAnsi="Wingdings" w:hint="default"/>
+        <w:sz w:val="20"/>
+      </w:rPr>
+    </w:lvl>
+    <w:lvl w:ilvl="3" w:tentative="1">
+      <w:start w:val="1"/>
+      <w:numFmt w:val="bullet"/>
+      <w:lvlText w:val=""/>
+      <w:lvlJc w:val="left"/>
+      <w:pPr>
+        <w:tabs>
+          <w:tab w:val="num" w:pos="2880"/>
+        </w:tabs>
+        <w:ind w:left="2880" w:hanging="360"/>
+      </w:pPr>
+      <w:rPr>
+        <w:rFonts w:ascii="Wingdings" w:hAnsi="Wingdings" w:hint="default"/>
+        <w:sz w:val="20"/>
+      </w:rPr>
+    </w:lvl>
+    <w:lvl w:ilvl="4" w:tentative="1">
+      <w:start w:val="1"/>
+      <w:numFmt w:val="bullet"/>
+      <w:lvlText w:val=""/>
+      <w:lvlJc w:val="left"/>
+      <w:pPr>
+        <w:tabs>
+          <w:tab w:val="num" w:pos="3600"/>
+        </w:tabs>
+        <w:ind w:left="3600" w:hanging="360"/>
+      </w:pPr>
+      <w:rPr>
+        <w:rFonts w:ascii="Wingdings" w:hAnsi="Wingdings" w:hint="default"/>
+        <w:sz w:val="20"/>
+      </w:rPr>
+    </w:lvl>
+    <w:lvl w:ilvl="5" w:tentative="1">
+      <w:start w:val="1"/>
+      <w:numFmt w:val="bullet"/>
+      <w:lvlText w:val=""/>
+      <w:lvlJc w:val="left"/>
+      <w:pPr>
+        <w:tabs>
+          <w:tab w:val="num" w:pos="4320"/>
+        </w:tabs>
+        <w:ind w:left="4320" w:hanging="360"/>
+      </w:pPr>
+      <w:rPr>
+        <w:rFonts w:ascii="Wingdings" w:hAnsi="Wingdings" w:hint="default"/>
+        <w:sz w:val="20"/>
+      </w:rPr>
+    </w:lvl>
+    <w:lvl w:ilvl="6" w:tentative="1">
+      <w:start w:val="1"/>
+      <w:numFmt w:val="bullet"/>
+      <w:lvlText w:val=""/>
+      <w:lvlJc w:val="left"/>
+      <w:pPr>
+        <w:tabs>
+          <w:tab w:val="num" w:pos="5040"/>
+        </w:tabs>
+        <w:ind w:left="5040" w:hanging="360"/>
+      </w:pPr>
+      <w:rPr>
+        <w:rFonts w:ascii="Wingdings" w:hAnsi="Wingdings" w:hint="default"/>
+        <w:sz w:val="20"/>
+      </w:rPr>
+    </w:lvl>
+    <w:lvl w:ilvl="7" w:tentative="1">
+      <w:start w:val="1"/>
+      <w:numFmt w:val="bullet"/>
+      <w:lvlText w:val=""/>
+      <w:lvlJc w:val="left"/>
+      <w:pPr>
+        <w:tabs>
+          <w:tab w:val="num" w:pos="5760"/>
+        </w:tabs>
+        <w:ind w:left="5760" w:hanging="360"/>
+      </w:pPr>
+      <w:rPr>
+        <w:rFonts w:ascii="Wingdings" w:hAnsi="Wingdings" w:hint="default"/>
+        <w:sz w:val="20"/>
+      </w:rPr>
+    </w:lvl>
+    <w:lvl w:ilvl="8" w:tentative="1">
+      <w:start w:val="1"/>
+      <w:numFmt w:val="bullet"/>
+      <w:lvlText w:val=""/>
+      <w:lvlJc w:val="left"/>
+      <w:pPr>
+        <w:tabs>
+          <w:tab w:val="num" w:pos="6480"/>
+        </w:tabs>
+        <w:ind w:left="6480" w:hanging="360"/>
+      </w:pPr>
+      <w:rPr>
+        <w:rFonts w:ascii="Wingdings" w:hAnsi="Wingdings" w:hint="default"/>
+        <w:sz w:val="20"/>
+      </w:rPr>
+    </w:lvl>
+  </w:abstractNum>
+  <w:abstractNum w:abstractNumId="1" w15:restartNumberingAfterBreak="0">
+    <w:nsid w:val="0FAE2ECA"/>
+    <w:multiLevelType w:val="multilevel"/>
+    <w:tmpl w:val="7B62E912"/>
+    <w:lvl w:ilvl="0">
+      <w:start w:val="1"/>
+      <w:numFmt w:val="decimal"/>
+      <w:lvlText w:val="%1."/>
+      <w:lvlJc w:val="left"/>
+      <w:pPr>
+        <w:tabs>
+          <w:tab w:val="num" w:pos="720"/>
+        </w:tabs>
+        <w:ind w:left="720" w:hanging="360"/>
+      </w:pPr>
+    </w:lvl>
+    <w:lvl w:ilvl="1">
+      <w:start w:val="1"/>
+      <w:numFmt w:val="bullet"/>
+      <w:lvlText w:val="o"/>
+      <w:lvlJc w:val="left"/>
+      <w:pPr>
+        <w:tabs>
+          <w:tab w:val="num" w:pos="1440"/>
+        </w:tabs>
+        <w:ind w:left="1440" w:hanging="360"/>
+      </w:pPr>
+      <w:rPr>
+        <w:rFonts w:ascii="Courier New" w:hAnsi="Courier New" w:hint="default"/>
+        <w:sz w:val="20"/>
+      </w:rPr>
+    </w:lvl>
+    <w:lvl w:ilvl="2" w:tentative="1">
+      <w:start w:val="1"/>
+      <w:numFmt w:val="decimal"/>
+      <w:lvlText w:val="%3."/>
+      <w:lvlJc w:val="left"/>
+      <w:pPr>
+        <w:tabs>
+          <w:tab w:val="num" w:pos="2160"/>
+        </w:tabs>
+        <w:ind w:left="2160" w:hanging="360"/>
+      </w:pPr>
+    </w:lvl>
+    <w:lvl w:ilvl="3" w:tentative="1">
+      <w:start w:val="1"/>
+      <w:numFmt w:val="decimal"/>
+      <w:lvlText w:val="%4."/>
+      <w:lvlJc w:val="left"/>
+      <w:pPr>
+        <w:tabs>
+          <w:tab w:val="num" w:pos="2880"/>
+        </w:tabs>
+        <w:ind w:left="2880" w:hanging="360"/>
+      </w:pPr>
+    </w:lvl>
+    <w:lvl w:ilvl="4" w:tentative="1">
+      <w:start w:val="1"/>
+      <w:numFmt w:val="decimal"/>
+      <w:lvlText w:val="%5."/>
+      <w:lvlJc w:val="left"/>
+      <w:pPr>
+        <w:tabs>
+          <w:tab w:val="num" w:pos="3600"/>
+        </w:tabs>
+        <w:ind w:left="3600" w:hanging="360"/>
+      </w:pPr>
+    </w:lvl>
+    <w:lvl w:ilvl="5" w:tentative="1">
+      <w:start w:val="1"/>
+      <w:numFmt w:val="decimal"/>
+      <w:lvlText w:val="%6."/>
+      <w:lvlJc w:val="left"/>
+      <w:pPr>
+        <w:tabs>
+          <w:tab w:val="num" w:pos="4320"/>
+        </w:tabs>
+        <w:ind w:left="4320" w:hanging="360"/>
+      </w:pPr>
+    </w:lvl>
+    <w:lvl w:ilvl="6" w:tentative="1">
+      <w:start w:val="1"/>
+      <w:numFmt w:val="decimal"/>
+      <w:lvlText w:val="%7."/>
+      <w:lvlJc w:val="left"/>
+      <w:pPr>
+        <w:tabs>
+          <w:tab w:val="num" w:pos="5040"/>
+        </w:tabs>
+        <w:ind w:left="5040" w:hanging="360"/>
+      </w:pPr>
+    </w:lvl>
+    <w:lvl w:ilvl="7" w:tentative="1">
+      <w:start w:val="1"/>
+      <w:numFmt w:val="decimal"/>
+      <w:lvlText w:val="%8."/>
+      <w:lvlJc w:val="left"/>
+      <w:pPr>
+        <w:tabs>
+          <w:tab w:val="num" w:pos="5760"/>
+        </w:tabs>
+        <w:ind w:left="5760" w:hanging="360"/>
+      </w:pPr>
+    </w:lvl>
+    <w:lvl w:ilvl="8" w:tentative="1">
+      <w:start w:val="1"/>
+      <w:numFmt w:val="decimal"/>
+      <w:lvlText w:val="%9."/>
+      <w:lvlJc w:val="left"/>
+      <w:pPr>
+        <w:tabs>
+          <w:tab w:val="num" w:pos="6480"/>
+        </w:tabs>
+        <w:ind w:left="6480" w:hanging="360"/>
+      </w:pPr>
+    </w:lvl>
+  </w:abstractNum>
+  <w:abstractNum w:abstractNumId="2" w15:restartNumberingAfterBreak="0">
+    <w:nsid w:val="19062C1F"/>
+    <w:multiLevelType w:val="multilevel"/>
+    <w:tmpl w:val="B472259C"/>
+    <w:lvl w:ilvl="0">
+      <w:start w:val="1"/>
+      <w:numFmt w:val="bullet"/>
+      <w:lvlText w:val=""/>
+      <w:lvlJc w:val="left"/>
+      <w:pPr>
+        <w:tabs>
+          <w:tab w:val="num" w:pos="720"/>
+        </w:tabs>
+        <w:ind w:left="720" w:hanging="360"/>
+      </w:pPr>
+      <w:rPr>
+        <w:rFonts w:ascii="Symbol" w:hAnsi="Symbol" w:hint="default"/>
+        <w:sz w:val="20"/>
+      </w:rPr>
+    </w:lvl>
+    <w:lvl w:ilvl="1">
+      <w:start w:val="1"/>
+      <w:numFmt w:val="bullet"/>
+      <w:lvlText w:val="o"/>
+      <w:lvlJc w:val="left"/>
+      <w:pPr>
+        <w:tabs>
+          <w:tab w:val="num" w:pos="1440"/>
+        </w:tabs>
+        <w:ind w:left="1440" w:hanging="360"/>
+      </w:pPr>
+      <w:rPr>
+        <w:rFonts w:ascii="Courier New" w:hAnsi="Courier New" w:hint="default"/>
+        <w:sz w:val="20"/>
+      </w:rPr>
+    </w:lvl>
+    <w:lvl w:ilvl="2" w:tentative="1">
+      <w:start w:val="1"/>
+      <w:numFmt w:val="bullet"/>
+      <w:lvlText w:val=""/>
+      <w:lvlJc w:val="left"/>
+      <w:pPr>
+        <w:tabs>
+          <w:tab w:val="num" w:pos="2160"/>
+        </w:tabs>
+        <w:ind w:left="2160" w:hanging="360"/>
+      </w:pPr>
+      <w:rPr>
+        <w:rFonts w:ascii="Wingdings" w:hAnsi="Wingdings" w:hint="default"/>
+        <w:sz w:val="20"/>
+      </w:rPr>
+    </w:lvl>
+    <w:lvl w:ilvl="3" w:tentative="1">
+      <w:start w:val="1"/>
+      <w:numFmt w:val="bullet"/>
+      <w:lvlText w:val=""/>
+      <w:lvlJc w:val="left"/>
+      <w:pPr>
+        <w:tabs>
+          <w:tab w:val="num" w:pos="2880"/>
+        </w:tabs>
+        <w:ind w:left="2880" w:hanging="360"/>
+      </w:pPr>
+      <w:rPr>
+        <w:rFonts w:ascii="Wingdings" w:hAnsi="Wingdings" w:hint="default"/>
+        <w:sz w:val="20"/>
+      </w:rPr>
+    </w:lvl>
+    <w:lvl w:ilvl="4" w:tentative="1">
+      <w:start w:val="1"/>
+      <w:numFmt w:val="bullet"/>
+      <w:lvlText w:val=""/>
+      <w:lvlJc w:val="left"/>
+      <w:pPr>
+        <w:tabs>
+          <w:tab w:val="num" w:pos="3600"/>
+        </w:tabs>
+        <w:ind w:left="3600" w:hanging="360"/>
+      </w:pPr>
+      <w:rPr>
+        <w:rFonts w:ascii="Wingdings" w:hAnsi="Wingdings" w:hint="default"/>
+        <w:sz w:val="20"/>
+      </w:rPr>
+    </w:lvl>
+    <w:lvl w:ilvl="5" w:tentative="1">
+      <w:start w:val="1"/>
+      <w:numFmt w:val="bullet"/>
+      <w:lvlText w:val=""/>
+      <w:lvlJc w:val="left"/>
+      <w:pPr>
+        <w:tabs>
+          <w:tab w:val="num" w:pos="4320"/>
+        </w:tabs>
+        <w:ind w:left="4320" w:hanging="360"/>
+      </w:pPr>
+      <w:rPr>
+        <w:rFonts w:ascii="Wingdings" w:hAnsi="Wingdings" w:hint="default"/>
+        <w:sz w:val="20"/>
+      </w:rPr>
+    </w:lvl>
+    <w:lvl w:ilvl="6" w:tentative="1">
+      <w:start w:val="1"/>
+      <w:numFmt w:val="bullet"/>
+      <w:lvlText w:val=""/>
+      <w:lvlJc w:val="left"/>
+      <w:pPr>
+        <w:tabs>
+          <w:tab w:val="num" w:pos="5040"/>
+        </w:tabs>
+        <w:ind w:left="5040" w:hanging="360"/>
+      </w:pPr>
+      <w:rPr>
+        <w:rFonts w:ascii="Wingdings" w:hAnsi="Wingdings" w:hint="default"/>
+        <w:sz w:val="20"/>
+      </w:rPr>
+    </w:lvl>
+    <w:lvl w:ilvl="7" w:tentative="1">
+      <w:start w:val="1"/>
+      <w:numFmt w:val="bullet"/>
+      <w:lvlText w:val=""/>
+      <w:lvlJc w:val="left"/>
+      <w:pPr>
+        <w:tabs>
+          <w:tab w:val="num" w:pos="5760"/>
+        </w:tabs>
+        <w:ind w:left="5760" w:hanging="360"/>
+      </w:pPr>
+      <w:rPr>
+        <w:rFonts w:ascii="Wingdings" w:hAnsi="Wingdings" w:hint="default"/>
+        <w:sz w:val="20"/>
+      </w:rPr>
+    </w:lvl>
+    <w:lvl w:ilvl="8" w:tentative="1">
+      <w:start w:val="1"/>
+      <w:numFmt w:val="bullet"/>
+      <w:lvlText w:val=""/>
+      <w:lvlJc w:val="left"/>
+      <w:pPr>
+        <w:tabs>
+          <w:tab w:val="num" w:pos="6480"/>
+        </w:tabs>
+        <w:ind w:left="6480" w:hanging="360"/>
+      </w:pPr>
+      <w:rPr>
+        <w:rFonts w:ascii="Wingdings" w:hAnsi="Wingdings" w:hint="default"/>
+        <w:sz w:val="20"/>
+      </w:rPr>
+    </w:lvl>
+  </w:abstractNum>
+  <w:abstractNum w:abstractNumId="3" w15:restartNumberingAfterBreak="0">
+    <w:nsid w:val="47FF4C84"/>
+    <w:multiLevelType w:val="multilevel"/>
+    <w:tmpl w:val="55285DCC"/>
     <w:lvl w:ilvl="0">
       <w:start w:val="1"/>
       <w:numFmt w:val="decimal"/>
@@ -14844,10 +15259,10 @@
       </w:pPr>
     </w:lvl>
   </w:abstractNum>
-  <w:abstractNum w:abstractNumId="1" w15:restartNumberingAfterBreak="0">
-    <w:nsid w:val="31A660E4"/>
+  <w:abstractNum w:abstractNumId="4" w15:restartNumberingAfterBreak="0">
+    <w:nsid w:val="4A4170B1"/>
     <w:multiLevelType w:val="multilevel"/>
-    <w:tmpl w:val="D1D46452"/>
+    <w:tmpl w:val="90F21A5A"/>
     <w:lvl w:ilvl="0">
       <w:start w:val="1"/>
       <w:numFmt w:val="bullet"/>
@@ -14993,159 +15408,10 @@
       </w:rPr>
     </w:lvl>
   </w:abstractNum>
-  <w:abstractNum w:abstractNumId="2" w15:restartNumberingAfterBreak="0">
-    <w:nsid w:val="32551400"/>
+  <w:abstractNum w:abstractNumId="5" w15:restartNumberingAfterBreak="0">
+    <w:nsid w:val="5F905953"/>
     <w:multiLevelType w:val="multilevel"/>
-    <w:tmpl w:val="0AD27B2C"/>
-    <w:lvl w:ilvl="0">
-      <w:start w:val="1"/>
-      <w:numFmt w:val="bullet"/>
-      <w:lvlText w:val=""/>
-      <w:lvlJc w:val="left"/>
-      <w:pPr>
-        <w:tabs>
-          <w:tab w:val="num" w:pos="720"/>
-        </w:tabs>
-        <w:ind w:left="720" w:hanging="360"/>
-      </w:pPr>
-      <w:rPr>
-        <w:rFonts w:ascii="Symbol" w:hAnsi="Symbol" w:hint="default"/>
-        <w:sz w:val="20"/>
-      </w:rPr>
-    </w:lvl>
-    <w:lvl w:ilvl="1">
-      <w:start w:val="1"/>
-      <w:numFmt w:val="bullet"/>
-      <w:lvlText w:val="o"/>
-      <w:lvlJc w:val="left"/>
-      <w:pPr>
-        <w:tabs>
-          <w:tab w:val="num" w:pos="1440"/>
-        </w:tabs>
-        <w:ind w:left="1440" w:hanging="360"/>
-      </w:pPr>
-      <w:rPr>
-        <w:rFonts w:ascii="Courier New" w:hAnsi="Courier New" w:hint="default"/>
-        <w:sz w:val="20"/>
-      </w:rPr>
-    </w:lvl>
-    <w:lvl w:ilvl="2" w:tentative="1">
-      <w:start w:val="1"/>
-      <w:numFmt w:val="bullet"/>
-      <w:lvlText w:val=""/>
-      <w:lvlJc w:val="left"/>
-      <w:pPr>
-        <w:tabs>
-          <w:tab w:val="num" w:pos="2160"/>
-        </w:tabs>
-        <w:ind w:left="2160" w:hanging="360"/>
-      </w:pPr>
-      <w:rPr>
-        <w:rFonts w:ascii="Wingdings" w:hAnsi="Wingdings" w:hint="default"/>
-        <w:sz w:val="20"/>
-      </w:rPr>
-    </w:lvl>
-    <w:lvl w:ilvl="3" w:tentative="1">
-      <w:start w:val="1"/>
-      <w:numFmt w:val="bullet"/>
-      <w:lvlText w:val=""/>
-      <w:lvlJc w:val="left"/>
-      <w:pPr>
-        <w:tabs>
-          <w:tab w:val="num" w:pos="2880"/>
-        </w:tabs>
-        <w:ind w:left="2880" w:hanging="360"/>
-      </w:pPr>
-      <w:rPr>
-        <w:rFonts w:ascii="Wingdings" w:hAnsi="Wingdings" w:hint="default"/>
-        <w:sz w:val="20"/>
-      </w:rPr>
-    </w:lvl>
-    <w:lvl w:ilvl="4" w:tentative="1">
-      <w:start w:val="1"/>
-      <w:numFmt w:val="bullet"/>
-      <w:lvlText w:val=""/>
-      <w:lvlJc w:val="left"/>
-      <w:pPr>
-        <w:tabs>
-          <w:tab w:val="num" w:pos="3600"/>
-        </w:tabs>
-        <w:ind w:left="3600" w:hanging="360"/>
-      </w:pPr>
-      <w:rPr>
-        <w:rFonts w:ascii="Wingdings" w:hAnsi="Wingdings" w:hint="default"/>
-        <w:sz w:val="20"/>
-      </w:rPr>
-    </w:lvl>
-    <w:lvl w:ilvl="5" w:tentative="1">
-      <w:start w:val="1"/>
-      <w:numFmt w:val="bullet"/>
-      <w:lvlText w:val=""/>
-      <w:lvlJc w:val="left"/>
-      <w:pPr>
-        <w:tabs>
-          <w:tab w:val="num" w:pos="4320"/>
-        </w:tabs>
-        <w:ind w:left="4320" w:hanging="360"/>
-      </w:pPr>
-      <w:rPr>
-        <w:rFonts w:ascii="Wingdings" w:hAnsi="Wingdings" w:hint="default"/>
-        <w:sz w:val="20"/>
-      </w:rPr>
-    </w:lvl>
-    <w:lvl w:ilvl="6" w:tentative="1">
-      <w:start w:val="1"/>
-      <w:numFmt w:val="bullet"/>
-      <w:lvlText w:val=""/>
-      <w:lvlJc w:val="left"/>
-      <w:pPr>
-        <w:tabs>
-          <w:tab w:val="num" w:pos="5040"/>
-        </w:tabs>
-        <w:ind w:left="5040" w:hanging="360"/>
-      </w:pPr>
-      <w:rPr>
-        <w:rFonts w:ascii="Wingdings" w:hAnsi="Wingdings" w:hint="default"/>
-        <w:sz w:val="20"/>
-      </w:rPr>
-    </w:lvl>
-    <w:lvl w:ilvl="7" w:tentative="1">
-      <w:start w:val="1"/>
-      <w:numFmt w:val="bullet"/>
-      <w:lvlText w:val=""/>
-      <w:lvlJc w:val="left"/>
-      <w:pPr>
-        <w:tabs>
-          <w:tab w:val="num" w:pos="5760"/>
-        </w:tabs>
-        <w:ind w:left="5760" w:hanging="360"/>
-      </w:pPr>
-      <w:rPr>
-        <w:rFonts w:ascii="Wingdings" w:hAnsi="Wingdings" w:hint="default"/>
-        <w:sz w:val="20"/>
-      </w:rPr>
-    </w:lvl>
-    <w:lvl w:ilvl="8" w:tentative="1">
-      <w:start w:val="1"/>
-      <w:numFmt w:val="bullet"/>
-      <w:lvlText w:val=""/>
-      <w:lvlJc w:val="left"/>
-      <w:pPr>
-        <w:tabs>
-          <w:tab w:val="num" w:pos="6480"/>
-        </w:tabs>
-        <w:ind w:left="6480" w:hanging="360"/>
-      </w:pPr>
-      <w:rPr>
-        <w:rFonts w:ascii="Wingdings" w:hAnsi="Wingdings" w:hint="default"/>
-        <w:sz w:val="20"/>
-      </w:rPr>
-    </w:lvl>
-  </w:abstractNum>
-  <w:abstractNum w:abstractNumId="3" w15:restartNumberingAfterBreak="0">
-    <w:nsid w:val="435A0D65"/>
-    <w:multiLevelType w:val="multilevel"/>
-    <w:tmpl w:val="2E24810E"/>
+    <w:tmpl w:val="0B506DE8"/>
     <w:lvl w:ilvl="0">
       <w:start w:val="1"/>
       <w:numFmt w:val="decimal"/>
@@ -15158,10 +15424,10 @@
         <w:ind w:left="720" w:hanging="360"/>
       </w:pPr>
     </w:lvl>
-    <w:lvl w:ilvl="1">
+    <w:lvl w:ilvl="1" w:tentative="1">
       <w:start w:val="1"/>
-      <w:numFmt w:val="bullet"/>
-      <w:lvlText w:val="o"/>
+      <w:numFmt w:val="decimal"/>
+      <w:lvlText w:val="%2."/>
       <w:lvlJc w:val="left"/>
       <w:pPr>
         <w:tabs>
@@ -15169,10 +15435,6 @@
         </w:tabs>
         <w:ind w:left="1440" w:hanging="360"/>
       </w:pPr>
-      <w:rPr>
-        <w:rFonts w:ascii="Courier New" w:hAnsi="Courier New" w:hint="default"/>
-        <w:sz w:val="20"/>
-      </w:rPr>
     </w:lvl>
     <w:lvl w:ilvl="2" w:tentative="1">
       <w:start w:val="1"/>
@@ -15259,285 +15521,23 @@
       </w:pPr>
     </w:lvl>
   </w:abstractNum>
-  <w:abstractNum w:abstractNumId="4" w15:restartNumberingAfterBreak="0">
-    <w:nsid w:val="4598298E"/>
-    <w:multiLevelType w:val="multilevel"/>
-    <w:tmpl w:val="B3B49742"/>
-    <w:lvl w:ilvl="0">
-      <w:start w:val="1"/>
-      <w:numFmt w:val="decimal"/>
-      <w:lvlText w:val="%1."/>
-      <w:lvlJc w:val="left"/>
-      <w:pPr>
-        <w:tabs>
-          <w:tab w:val="num" w:pos="720"/>
-        </w:tabs>
-        <w:ind w:left="720" w:hanging="360"/>
-      </w:pPr>
-    </w:lvl>
-    <w:lvl w:ilvl="1" w:tentative="1">
-      <w:start w:val="1"/>
-      <w:numFmt w:val="decimal"/>
-      <w:lvlText w:val="%2."/>
-      <w:lvlJc w:val="left"/>
-      <w:pPr>
-        <w:tabs>
-          <w:tab w:val="num" w:pos="1440"/>
-        </w:tabs>
-        <w:ind w:left="1440" w:hanging="360"/>
-      </w:pPr>
-    </w:lvl>
-    <w:lvl w:ilvl="2" w:tentative="1">
-      <w:start w:val="1"/>
-      <w:numFmt w:val="decimal"/>
-      <w:lvlText w:val="%3."/>
-      <w:lvlJc w:val="left"/>
-      <w:pPr>
-        <w:tabs>
-          <w:tab w:val="num" w:pos="2160"/>
-        </w:tabs>
-        <w:ind w:left="2160" w:hanging="360"/>
-      </w:pPr>
-    </w:lvl>
-    <w:lvl w:ilvl="3" w:tentative="1">
-      <w:start w:val="1"/>
-      <w:numFmt w:val="decimal"/>
-      <w:lvlText w:val="%4."/>
-      <w:lvlJc w:val="left"/>
-      <w:pPr>
-        <w:tabs>
-          <w:tab w:val="num" w:pos="2880"/>
-        </w:tabs>
-        <w:ind w:left="2880" w:hanging="360"/>
-      </w:pPr>
-    </w:lvl>
-    <w:lvl w:ilvl="4" w:tentative="1">
-      <w:start w:val="1"/>
-      <w:numFmt w:val="decimal"/>
-      <w:lvlText w:val="%5."/>
-      <w:lvlJc w:val="left"/>
-      <w:pPr>
-        <w:tabs>
-          <w:tab w:val="num" w:pos="3600"/>
-        </w:tabs>
-        <w:ind w:left="3600" w:hanging="360"/>
-      </w:pPr>
-    </w:lvl>
-    <w:lvl w:ilvl="5" w:tentative="1">
-      <w:start w:val="1"/>
-      <w:numFmt w:val="decimal"/>
-      <w:lvlText w:val="%6."/>
-      <w:lvlJc w:val="left"/>
-      <w:pPr>
-        <w:tabs>
-          <w:tab w:val="num" w:pos="4320"/>
-        </w:tabs>
-        <w:ind w:left="4320" w:hanging="360"/>
-      </w:pPr>
-    </w:lvl>
-    <w:lvl w:ilvl="6" w:tentative="1">
-      <w:start w:val="1"/>
-      <w:numFmt w:val="decimal"/>
-      <w:lvlText w:val="%7."/>
-      <w:lvlJc w:val="left"/>
-      <w:pPr>
-        <w:tabs>
-          <w:tab w:val="num" w:pos="5040"/>
-        </w:tabs>
-        <w:ind w:left="5040" w:hanging="360"/>
-      </w:pPr>
-    </w:lvl>
-    <w:lvl w:ilvl="7" w:tentative="1">
-      <w:start w:val="1"/>
-      <w:numFmt w:val="decimal"/>
-      <w:lvlText w:val="%8."/>
-      <w:lvlJc w:val="left"/>
-      <w:pPr>
-        <w:tabs>
-          <w:tab w:val="num" w:pos="5760"/>
-        </w:tabs>
-        <w:ind w:left="5760" w:hanging="360"/>
-      </w:pPr>
-    </w:lvl>
-    <w:lvl w:ilvl="8" w:tentative="1">
-      <w:start w:val="1"/>
-      <w:numFmt w:val="decimal"/>
-      <w:lvlText w:val="%9."/>
-      <w:lvlJc w:val="left"/>
-      <w:pPr>
-        <w:tabs>
-          <w:tab w:val="num" w:pos="6480"/>
-        </w:tabs>
-        <w:ind w:left="6480" w:hanging="360"/>
-      </w:pPr>
-    </w:lvl>
-  </w:abstractNum>
-  <w:abstractNum w:abstractNumId="5" w15:restartNumberingAfterBreak="0">
-    <w:nsid w:val="49F331A4"/>
-    <w:multiLevelType w:val="multilevel"/>
-    <w:tmpl w:val="3404E992"/>
-    <w:lvl w:ilvl="0">
-      <w:start w:val="1"/>
-      <w:numFmt w:val="bullet"/>
-      <w:lvlText w:val=""/>
-      <w:lvlJc w:val="left"/>
-      <w:pPr>
-        <w:tabs>
-          <w:tab w:val="num" w:pos="720"/>
-        </w:tabs>
-        <w:ind w:left="720" w:hanging="360"/>
-      </w:pPr>
-      <w:rPr>
-        <w:rFonts w:ascii="Symbol" w:hAnsi="Symbol" w:hint="default"/>
-        <w:sz w:val="20"/>
-      </w:rPr>
-    </w:lvl>
-    <w:lvl w:ilvl="1">
-      <w:start w:val="1"/>
-      <w:numFmt w:val="bullet"/>
-      <w:lvlText w:val="o"/>
-      <w:lvlJc w:val="left"/>
-      <w:pPr>
-        <w:tabs>
-          <w:tab w:val="num" w:pos="1440"/>
-        </w:tabs>
-        <w:ind w:left="1440" w:hanging="360"/>
-      </w:pPr>
-      <w:rPr>
-        <w:rFonts w:ascii="Courier New" w:hAnsi="Courier New" w:hint="default"/>
-        <w:sz w:val="20"/>
-      </w:rPr>
-    </w:lvl>
-    <w:lvl w:ilvl="2" w:tentative="1">
-      <w:start w:val="1"/>
-      <w:numFmt w:val="bullet"/>
-      <w:lvlText w:val=""/>
-      <w:lvlJc w:val="left"/>
-      <w:pPr>
-        <w:tabs>
-          <w:tab w:val="num" w:pos="2160"/>
-        </w:tabs>
-        <w:ind w:left="2160" w:hanging="360"/>
-      </w:pPr>
-      <w:rPr>
-        <w:rFonts w:ascii="Wingdings" w:hAnsi="Wingdings" w:hint="default"/>
-        <w:sz w:val="20"/>
-      </w:rPr>
-    </w:lvl>
-    <w:lvl w:ilvl="3" w:tentative="1">
-      <w:start w:val="1"/>
-      <w:numFmt w:val="bullet"/>
-      <w:lvlText w:val=""/>
-      <w:lvlJc w:val="left"/>
-      <w:pPr>
-        <w:tabs>
-          <w:tab w:val="num" w:pos="2880"/>
-        </w:tabs>
-        <w:ind w:left="2880" w:hanging="360"/>
-      </w:pPr>
-      <w:rPr>
-        <w:rFonts w:ascii="Wingdings" w:hAnsi="Wingdings" w:hint="default"/>
-        <w:sz w:val="20"/>
-      </w:rPr>
-    </w:lvl>
-    <w:lvl w:ilvl="4" w:tentative="1">
-      <w:start w:val="1"/>
-      <w:numFmt w:val="bullet"/>
-      <w:lvlText w:val=""/>
-      <w:lvlJc w:val="left"/>
-      <w:pPr>
-        <w:tabs>
-          <w:tab w:val="num" w:pos="3600"/>
-        </w:tabs>
-        <w:ind w:left="3600" w:hanging="360"/>
-      </w:pPr>
-      <w:rPr>
-        <w:rFonts w:ascii="Wingdings" w:hAnsi="Wingdings" w:hint="default"/>
-        <w:sz w:val="20"/>
-      </w:rPr>
-    </w:lvl>
-    <w:lvl w:ilvl="5" w:tentative="1">
-      <w:start w:val="1"/>
-      <w:numFmt w:val="bullet"/>
-      <w:lvlText w:val=""/>
-      <w:lvlJc w:val="left"/>
-      <w:pPr>
-        <w:tabs>
-          <w:tab w:val="num" w:pos="4320"/>
-        </w:tabs>
-        <w:ind w:left="4320" w:hanging="360"/>
-      </w:pPr>
-      <w:rPr>
-        <w:rFonts w:ascii="Wingdings" w:hAnsi="Wingdings" w:hint="default"/>
-        <w:sz w:val="20"/>
-      </w:rPr>
-    </w:lvl>
-    <w:lvl w:ilvl="6" w:tentative="1">
-      <w:start w:val="1"/>
-      <w:numFmt w:val="bullet"/>
-      <w:lvlText w:val=""/>
-      <w:lvlJc w:val="left"/>
-      <w:pPr>
-        <w:tabs>
-          <w:tab w:val="num" w:pos="5040"/>
-        </w:tabs>
-        <w:ind w:left="5040" w:hanging="360"/>
-      </w:pPr>
-      <w:rPr>
-        <w:rFonts w:ascii="Wingdings" w:hAnsi="Wingdings" w:hint="default"/>
-        <w:sz w:val="20"/>
-      </w:rPr>
-    </w:lvl>
-    <w:lvl w:ilvl="7" w:tentative="1">
-      <w:start w:val="1"/>
-      <w:numFmt w:val="bullet"/>
-      <w:lvlText w:val=""/>
-      <w:lvlJc w:val="left"/>
-      <w:pPr>
-        <w:tabs>
-          <w:tab w:val="num" w:pos="5760"/>
-        </w:tabs>
-        <w:ind w:left="5760" w:hanging="360"/>
-      </w:pPr>
-      <w:rPr>
-        <w:rFonts w:ascii="Wingdings" w:hAnsi="Wingdings" w:hint="default"/>
-        <w:sz w:val="20"/>
-      </w:rPr>
-    </w:lvl>
-    <w:lvl w:ilvl="8" w:tentative="1">
-      <w:start w:val="1"/>
-      <w:numFmt w:val="bullet"/>
-      <w:lvlText w:val=""/>
-      <w:lvlJc w:val="left"/>
-      <w:pPr>
-        <w:tabs>
-          <w:tab w:val="num" w:pos="6480"/>
-        </w:tabs>
-        <w:ind w:left="6480" w:hanging="360"/>
-      </w:pPr>
-      <w:rPr>
-        <w:rFonts w:ascii="Wingdings" w:hAnsi="Wingdings" w:hint="default"/>
-        <w:sz w:val="20"/>
-      </w:rPr>
-    </w:lvl>
-  </w:abstractNum>
-  <w:num w:numId="1" w16cid:durableId="2035694850">
-    <w:abstractNumId w:val="1"/>
+  <w:num w:numId="1" w16cid:durableId="689062706">
+    <w:abstractNumId w:val="4"/>
   </w:num>
-  <w:num w:numId="2" w16cid:durableId="1452432112">
+  <w:num w:numId="2" w16cid:durableId="313066513">
     <w:abstractNumId w:val="2"/>
   </w:num>
-  <w:num w:numId="3" w16cid:durableId="468204075">
-    <w:abstractNumId w:val="4"/>
+  <w:num w:numId="3" w16cid:durableId="1869172614">
+    <w:abstractNumId w:val="3"/>
   </w:num>
-  <w:num w:numId="4" w16cid:durableId="288049483">
+  <w:num w:numId="4" w16cid:durableId="1789591577">
+    <w:abstractNumId w:val="0"/>
+  </w:num>
+  <w:num w:numId="5" w16cid:durableId="1671180661">
     <w:abstractNumId w:val="5"/>
   </w:num>
-  <w:num w:numId="5" w16cid:durableId="1030035585">
-    <w:abstractNumId w:val="0"/>
-  </w:num>
-  <w:num w:numId="6" w16cid:durableId="981085453">
-    <w:abstractNumId w:val="3"/>
+  <w:num w:numId="6" w16cid:durableId="1807234389">
+    <w:abstractNumId w:val="1"/>
   </w:num>
 </w:numbering>
 </file>

</xml_diff>